<commit_message>
Report, project overview progress
</commit_message>
<xml_diff>
--- a/Report/SiteSafeReport.docx
+++ b/Report/SiteSafeReport.docx
@@ -556,7 +556,7 @@
           <w:szCs w:val="32"/>
         </w:rPr>
         <w:drawing>
-          <wp:anchor distT="0" distB="0" distL="114300" distR="114300" simplePos="0" relativeHeight="251540480" behindDoc="0" locked="0" layoutInCell="1" allowOverlap="1" wp14:anchorId="1AE65912" wp14:editId="44FD2F26">
+          <wp:anchor distT="0" distB="0" distL="114300" distR="114300" simplePos="0" relativeHeight="251540480" behindDoc="0" locked="0" layoutInCell="1" allowOverlap="1" wp14:anchorId="1AE65912" wp14:editId="236A2EF4">
             <wp:simplePos x="0" y="0"/>
             <wp:positionH relativeFrom="column">
               <wp:posOffset>60960</wp:posOffset>
@@ -835,21 +835,12 @@
                               </w:rPr>
                               <w:t xml:space="preserve"> </w:t>
                             </w:r>
-                            <w:proofErr w:type="spellStart"/>
                             <w:r>
                               <w:rPr>
                                 <w:sz w:val="18"/>
                                 <w:szCs w:val="18"/>
                               </w:rPr>
-                              <w:t>SiteSafe</w:t>
-                            </w:r>
-                            <w:proofErr w:type="spellEnd"/>
-                            <w:r>
-                              <w:rPr>
-                                <w:sz w:val="18"/>
-                                <w:szCs w:val="18"/>
-                              </w:rPr>
-                              <w:t xml:space="preserve"> Logo</w:t>
+                              <w:t>SiteSafe Logo</w:t>
                             </w:r>
                           </w:p>
                         </w:txbxContent>
@@ -916,21 +907,12 @@
                         </w:rPr>
                         <w:t xml:space="preserve"> </w:t>
                       </w:r>
-                      <w:proofErr w:type="spellStart"/>
                       <w:r>
                         <w:rPr>
                           <w:sz w:val="18"/>
                           <w:szCs w:val="18"/>
                         </w:rPr>
-                        <w:t>SiteSafe</w:t>
-                      </w:r>
-                      <w:proofErr w:type="spellEnd"/>
-                      <w:r>
-                        <w:rPr>
-                          <w:sz w:val="18"/>
-                          <w:szCs w:val="18"/>
-                        </w:rPr>
-                        <w:t xml:space="preserve"> Logo</w:t>
+                        <w:t>SiteSafe Logo</w:t>
                       </w:r>
                     </w:p>
                   </w:txbxContent>
@@ -1844,11 +1826,517 @@
     </w:p>
     <w:p>
       <w:pPr>
+        <w:rPr>
+          <w:lang w:val="en-GB"/>
+        </w:rPr>
+      </w:pPr>
+    </w:p>
+    <w:p>
+      <w:pPr>
+        <w:rPr>
+          <w:lang w:val="en-GB"/>
+        </w:rPr>
+      </w:pPr>
+    </w:p>
+    <w:p>
+      <w:r>
+        <w:lastRenderedPageBreak/>
+        <w:t>Initially, when the user accesses the application, if they haven't logged in before, they are directed to the login screen. If they have a user account linked to a company, they can log in here. Alternatively, they can navigate to the registration screen to register a new company along with an initial admin user. Both normal users and admin users use the same screen to log in.</w:t>
+      </w:r>
+    </w:p>
+    <w:p>
+      <w:pPr>
+        <w:rPr>
+          <w:lang w:val="en-GB"/>
+        </w:rPr>
+      </w:pPr>
+      <w:r>
+        <w:rPr>
+          <w:noProof/>
+          <w:lang w:val="en-GB"/>
+        </w:rPr>
+        <w:drawing>
+          <wp:inline distT="0" distB="0" distL="0" distR="0" wp14:anchorId="30365AF8" wp14:editId="736922D5">
+            <wp:extent cx="5731510" cy="2722880"/>
+            <wp:effectExtent l="0" t="0" r="2540" b="1270"/>
+            <wp:docPr id="1380574632" name="Picture 5"/>
+            <wp:cNvGraphicFramePr>
+              <a:graphicFrameLocks xmlns:a="http://schemas.openxmlformats.org/drawingml/2006/main" noChangeAspect="1"/>
+            </wp:cNvGraphicFramePr>
+            <a:graphic xmlns:a="http://schemas.openxmlformats.org/drawingml/2006/main">
+              <a:graphicData uri="http://schemas.openxmlformats.org/drawingml/2006/picture">
+                <pic:pic xmlns:pic="http://schemas.openxmlformats.org/drawingml/2006/picture">
+                  <pic:nvPicPr>
+                    <pic:cNvPr id="1380574632" name="Picture 1380574632"/>
+                    <pic:cNvPicPr/>
+                  </pic:nvPicPr>
+                  <pic:blipFill>
+                    <a:blip r:embed="rId14" cstate="print">
+                      <a:extLst>
+                        <a:ext uri="{28A0092B-C50C-407E-A947-70E740481C1C}">
+                          <a14:useLocalDpi xmlns:a14="http://schemas.microsoft.com/office/drawing/2010/main" val="0"/>
+                        </a:ext>
+                      </a:extLst>
+                    </a:blip>
+                    <a:stretch>
+                      <a:fillRect/>
+                    </a:stretch>
+                  </pic:blipFill>
+                  <pic:spPr>
+                    <a:xfrm>
+                      <a:off x="0" y="0"/>
+                      <a:ext cx="5731510" cy="2722880"/>
+                    </a:xfrm>
+                    <a:prstGeom prst="rect">
+                      <a:avLst/>
+                    </a:prstGeom>
+                  </pic:spPr>
+                </pic:pic>
+              </a:graphicData>
+            </a:graphic>
+          </wp:inline>
+        </w:drawing>
+      </w:r>
+    </w:p>
+    <w:p>
+      <w:r>
+        <w:t>If the “Don’t have an account? Register here” button is pressed, the user is taken to a screen where they can create a new company and an initial admin account. From there, the user can log in as the admin and manage the account.</w:t>
+      </w:r>
+    </w:p>
+    <w:p>
+      <w:pPr>
+        <w:rPr>
+          <w:lang w:val="en-GB"/>
+        </w:rPr>
+      </w:pPr>
+      <w:r>
+        <w:rPr>
+          <w:noProof/>
+          <w:lang w:val="en-GB"/>
+        </w:rPr>
+        <w:drawing>
+          <wp:inline distT="0" distB="0" distL="0" distR="0" wp14:anchorId="53A945EF" wp14:editId="0DD65AE1">
+            <wp:extent cx="5731510" cy="2737485"/>
+            <wp:effectExtent l="0" t="0" r="2540" b="5715"/>
+            <wp:docPr id="1129281438" name="Picture 6" descr="A registration form with red and blue text&#10;&#10;AI-generated content may be incorrect."/>
+            <wp:cNvGraphicFramePr>
+              <a:graphicFrameLocks xmlns:a="http://schemas.openxmlformats.org/drawingml/2006/main" noChangeAspect="1"/>
+            </wp:cNvGraphicFramePr>
+            <a:graphic xmlns:a="http://schemas.openxmlformats.org/drawingml/2006/main">
+              <a:graphicData uri="http://schemas.openxmlformats.org/drawingml/2006/picture">
+                <pic:pic xmlns:pic="http://schemas.openxmlformats.org/drawingml/2006/picture">
+                  <pic:nvPicPr>
+                    <pic:cNvPr id="1129281438" name="Picture 6" descr="A registration form with red and blue text&#10;&#10;AI-generated content may be incorrect."/>
+                    <pic:cNvPicPr/>
+                  </pic:nvPicPr>
+                  <pic:blipFill>
+                    <a:blip r:embed="rId15" cstate="print">
+                      <a:extLst>
+                        <a:ext uri="{28A0092B-C50C-407E-A947-70E740481C1C}">
+                          <a14:useLocalDpi xmlns:a14="http://schemas.microsoft.com/office/drawing/2010/main" val="0"/>
+                        </a:ext>
+                      </a:extLst>
+                    </a:blip>
+                    <a:stretch>
+                      <a:fillRect/>
+                    </a:stretch>
+                  </pic:blipFill>
+                  <pic:spPr>
+                    <a:xfrm>
+                      <a:off x="0" y="0"/>
+                      <a:ext cx="5731510" cy="2737485"/>
+                    </a:xfrm>
+                    <a:prstGeom prst="rect">
+                      <a:avLst/>
+                    </a:prstGeom>
+                  </pic:spPr>
+                </pic:pic>
+              </a:graphicData>
+            </a:graphic>
+          </wp:inline>
+        </w:drawing>
+      </w:r>
+    </w:p>
+    <w:p>
+      <w:pPr>
+        <w:rPr>
+          <w:lang w:val="en-GB"/>
+        </w:rPr>
+      </w:pPr>
+    </w:p>
+    <w:p>
+      <w:pPr>
+        <w:rPr>
+          <w:lang w:val="en-GB"/>
+        </w:rPr>
+      </w:pPr>
+    </w:p>
+    <w:p>
+      <w:pPr>
+        <w:rPr>
+          <w:lang w:val="en-GB"/>
+        </w:rPr>
+      </w:pPr>
+    </w:p>
+    <w:p>
+      <w:pPr>
+        <w:rPr>
+          <w:lang w:val="en-GB"/>
+        </w:rPr>
+      </w:pPr>
+    </w:p>
+    <w:p>
+      <w:pPr>
+        <w:rPr>
+          <w:lang w:val="en-GB"/>
+        </w:rPr>
+      </w:pPr>
+      <w:r>
+        <w:rPr>
+          <w:lang w:val="en-GB"/>
+        </w:rPr>
+        <w:lastRenderedPageBreak/>
+        <w:t xml:space="preserve">Once the user logs in, they are brought to the main screen, which contains </w:t>
+      </w:r>
+      <w:proofErr w:type="gramStart"/>
+      <w:r>
+        <w:rPr>
+          <w:lang w:val="en-GB"/>
+        </w:rPr>
+        <w:t>the majority of</w:t>
+      </w:r>
+      <w:proofErr w:type="gramEnd"/>
+      <w:r>
+        <w:rPr>
+          <w:lang w:val="en-GB"/>
+        </w:rPr>
+        <w:t xml:space="preserve"> the options available to them. The main screen features a clean and simple design, eliminating the need for complicated user manuals </w:t>
+      </w:r>
+      <w:r>
+        <w:rPr>
+          <w:lang w:val="en-GB"/>
+        </w:rPr>
+        <w:t>and</w:t>
+      </w:r>
+      <w:r>
+        <w:rPr>
+          <w:lang w:val="en-GB"/>
+        </w:rPr>
+        <w:t xml:space="preserve"> costly training for the company. All buttons are intuitive and clearly </w:t>
+      </w:r>
+      <w:r>
+        <w:rPr>
+          <w:lang w:val="en-GB"/>
+        </w:rPr>
+        <w:t>labelled</w:t>
+      </w:r>
+      <w:r>
+        <w:rPr>
+          <w:lang w:val="en-GB"/>
+        </w:rPr>
+        <w:t>, giving the user a clear understanding of their function.</w:t>
+      </w:r>
+    </w:p>
+    <w:p>
+      <w:pPr>
+        <w:rPr>
+          <w:lang w:val="en-GB"/>
+        </w:rPr>
+      </w:pPr>
+      <w:r>
+        <w:rPr>
+          <w:lang w:val="en-GB"/>
+        </w:rPr>
+        <w:t>At the top, there is a menu with all the essential options the user may need, such as managing users, cameras, and detections. There are also options to view the documentation, read a project description, and contact the creator. On the far right of the menu, the logged-in user’s name is displayed. When clicked, it reveals an option to log out.</w:t>
+      </w:r>
+    </w:p>
+    <w:p>
+      <w:pPr>
+        <w:rPr>
+          <w:lang w:val="en-GB"/>
+        </w:rPr>
+      </w:pPr>
+      <w:r>
+        <w:rPr>
+          <w:lang w:val="en-GB"/>
+        </w:rPr>
+        <w:t xml:space="preserve">In the main section, the application’s logo is displayed in the top left. In the </w:t>
+      </w:r>
+      <w:proofErr w:type="spellStart"/>
+      <w:r>
+        <w:rPr>
+          <w:lang w:val="en-GB"/>
+        </w:rPr>
+        <w:t>center</w:t>
+      </w:r>
+      <w:proofErr w:type="spellEnd"/>
+      <w:r>
+        <w:rPr>
+          <w:lang w:val="en-GB"/>
+        </w:rPr>
+        <w:t>, users can see options like “Choose Camera,” “Settings,” “Dashboard,” and “Add Second Camera,” all of which are self-explanatory.</w:t>
+      </w:r>
+    </w:p>
+    <w:p>
+      <w:pPr>
+        <w:rPr>
+          <w:lang w:val="en-GB"/>
+        </w:rPr>
+      </w:pPr>
+      <w:r>
+        <w:rPr>
+          <w:noProof/>
+          <w:lang w:val="en-GB"/>
+        </w:rPr>
+        <w:drawing>
+          <wp:inline distT="0" distB="0" distL="0" distR="0" wp14:anchorId="6303F170" wp14:editId="694B6E60">
+            <wp:extent cx="5731510" cy="2588895"/>
+            <wp:effectExtent l="0" t="0" r="2540" b="1905"/>
+            <wp:docPr id="796709349" name="Picture 7" descr="A screenshot of a computer&#10;&#10;AI-generated content may be incorrect."/>
+            <wp:cNvGraphicFramePr>
+              <a:graphicFrameLocks xmlns:a="http://schemas.openxmlformats.org/drawingml/2006/main" noChangeAspect="1"/>
+            </wp:cNvGraphicFramePr>
+            <a:graphic xmlns:a="http://schemas.openxmlformats.org/drawingml/2006/main">
+              <a:graphicData uri="http://schemas.openxmlformats.org/drawingml/2006/picture">
+                <pic:pic xmlns:pic="http://schemas.openxmlformats.org/drawingml/2006/picture">
+                  <pic:nvPicPr>
+                    <pic:cNvPr id="796709349" name="Picture 7" descr="A screenshot of a computer&#10;&#10;AI-generated content may be incorrect."/>
+                    <pic:cNvPicPr/>
+                  </pic:nvPicPr>
+                  <pic:blipFill>
+                    <a:blip r:embed="rId16" cstate="print">
+                      <a:extLst>
+                        <a:ext uri="{28A0092B-C50C-407E-A947-70E740481C1C}">
+                          <a14:useLocalDpi xmlns:a14="http://schemas.microsoft.com/office/drawing/2010/main" val="0"/>
+                        </a:ext>
+                      </a:extLst>
+                    </a:blip>
+                    <a:stretch>
+                      <a:fillRect/>
+                    </a:stretch>
+                  </pic:blipFill>
+                  <pic:spPr>
+                    <a:xfrm>
+                      <a:off x="0" y="0"/>
+                      <a:ext cx="5731510" cy="2588895"/>
+                    </a:xfrm>
+                    <a:prstGeom prst="rect">
+                      <a:avLst/>
+                    </a:prstGeom>
+                  </pic:spPr>
+                </pic:pic>
+              </a:graphicData>
+            </a:graphic>
+          </wp:inline>
+        </w:drawing>
+      </w:r>
+    </w:p>
+    <w:p>
+      <w:pPr>
+        <w:rPr>
+          <w:lang w:val="en-GB"/>
+        </w:rPr>
+      </w:pPr>
+      <w:r>
+        <w:rPr>
+          <w:lang w:val="en-GB"/>
+        </w:rPr>
+        <w:t>The Description menu option brings the user to a simple description of the application and the technologies used to make the application work.</w:t>
+      </w:r>
+    </w:p>
+    <w:p>
+      <w:pPr>
+        <w:rPr>
+          <w:lang w:val="en-GB"/>
+        </w:rPr>
+      </w:pPr>
+      <w:r>
+        <w:rPr>
+          <w:noProof/>
+          <w:lang w:val="en-GB"/>
+        </w:rPr>
+        <w:drawing>
+          <wp:inline distT="0" distB="0" distL="0" distR="0" wp14:anchorId="4E677B2D" wp14:editId="0C975852">
+            <wp:extent cx="5731510" cy="2597785"/>
+            <wp:effectExtent l="0" t="0" r="2540" b="0"/>
+            <wp:docPr id="945243528" name="Picture 8" descr="A screenshot of a computer&#10;&#10;AI-generated content may be incorrect."/>
+            <wp:cNvGraphicFramePr>
+              <a:graphicFrameLocks xmlns:a="http://schemas.openxmlformats.org/drawingml/2006/main" noChangeAspect="1"/>
+            </wp:cNvGraphicFramePr>
+            <a:graphic xmlns:a="http://schemas.openxmlformats.org/drawingml/2006/main">
+              <a:graphicData uri="http://schemas.openxmlformats.org/drawingml/2006/picture">
+                <pic:pic xmlns:pic="http://schemas.openxmlformats.org/drawingml/2006/picture">
+                  <pic:nvPicPr>
+                    <pic:cNvPr id="945243528" name="Picture 8" descr="A screenshot of a computer&#10;&#10;AI-generated content may be incorrect."/>
+                    <pic:cNvPicPr/>
+                  </pic:nvPicPr>
+                  <pic:blipFill>
+                    <a:blip r:embed="rId17" cstate="print">
+                      <a:extLst>
+                        <a:ext uri="{28A0092B-C50C-407E-A947-70E740481C1C}">
+                          <a14:useLocalDpi xmlns:a14="http://schemas.microsoft.com/office/drawing/2010/main" val="0"/>
+                        </a:ext>
+                      </a:extLst>
+                    </a:blip>
+                    <a:stretch>
+                      <a:fillRect/>
+                    </a:stretch>
+                  </pic:blipFill>
+                  <pic:spPr>
+                    <a:xfrm>
+                      <a:off x="0" y="0"/>
+                      <a:ext cx="5731510" cy="2597785"/>
+                    </a:xfrm>
+                    <a:prstGeom prst="rect">
+                      <a:avLst/>
+                    </a:prstGeom>
+                  </pic:spPr>
+                </pic:pic>
+              </a:graphicData>
+            </a:graphic>
+          </wp:inline>
+        </w:drawing>
+      </w:r>
+    </w:p>
+    <w:p>
+      <w:pPr>
+        <w:rPr>
+          <w:lang w:val="en-GB"/>
+        </w:rPr>
+      </w:pPr>
+    </w:p>
+    <w:p>
+      <w:pPr>
+        <w:rPr>
+          <w:lang w:val="en-GB"/>
+        </w:rPr>
+      </w:pPr>
+    </w:p>
+    <w:p>
+      <w:pPr>
+        <w:rPr>
+          <w:lang w:val="en-GB"/>
+        </w:rPr>
+      </w:pPr>
+    </w:p>
+    <w:p>
+      <w:pPr>
+        <w:rPr>
+          <w:lang w:val="en-GB"/>
+        </w:rPr>
+      </w:pPr>
+    </w:p>
+    <w:p>
+      <w:pPr>
+        <w:rPr>
+          <w:lang w:val="en-GB"/>
+        </w:rPr>
+      </w:pPr>
+    </w:p>
+    <w:p>
+      <w:pPr>
+        <w:rPr>
+          <w:lang w:val="en-GB"/>
+        </w:rPr>
+      </w:pPr>
+    </w:p>
+    <w:p>
+      <w:pPr>
+        <w:rPr>
+          <w:lang w:val="en-GB"/>
+        </w:rPr>
+      </w:pPr>
+    </w:p>
+    <w:p>
+      <w:pPr>
+        <w:rPr>
+          <w:lang w:val="en-GB"/>
+        </w:rPr>
+      </w:pPr>
+    </w:p>
+    <w:p>
+      <w:pPr>
+        <w:rPr>
+          <w:lang w:val="en-GB"/>
+        </w:rPr>
+      </w:pPr>
+    </w:p>
+    <w:p>
+      <w:pPr>
+        <w:rPr>
+          <w:lang w:val="en-GB"/>
+        </w:rPr>
+      </w:pPr>
+    </w:p>
+    <w:p>
+      <w:pPr>
+        <w:rPr>
+          <w:lang w:val="en-GB"/>
+        </w:rPr>
+      </w:pPr>
+    </w:p>
+    <w:p>
+      <w:pPr>
+        <w:rPr>
+          <w:lang w:val="en-GB"/>
+        </w:rPr>
+      </w:pPr>
+    </w:p>
+    <w:p>
+      <w:pPr>
+        <w:rPr>
+          <w:lang w:val="en-GB"/>
+        </w:rPr>
+      </w:pPr>
+    </w:p>
+    <w:p>
+      <w:pPr>
+        <w:rPr>
+          <w:lang w:val="en-GB"/>
+        </w:rPr>
+      </w:pPr>
+    </w:p>
+    <w:p>
+      <w:pPr>
+        <w:rPr>
+          <w:lang w:val="en-GB"/>
+        </w:rPr>
+      </w:pPr>
+    </w:p>
+    <w:p>
+      <w:pPr>
+        <w:rPr>
+          <w:lang w:val="en-GB"/>
+        </w:rPr>
+      </w:pPr>
+    </w:p>
+    <w:p>
+      <w:pPr>
+        <w:rPr>
+          <w:lang w:val="en-GB"/>
+        </w:rPr>
+      </w:pPr>
+    </w:p>
+    <w:p>
+      <w:pPr>
+        <w:rPr>
+          <w:lang w:val="en-GB"/>
+        </w:rPr>
+      </w:pPr>
+    </w:p>
+    <w:p>
+      <w:pPr>
+        <w:rPr>
+          <w:lang w:val="en-GB"/>
+        </w:rPr>
+      </w:pPr>
+    </w:p>
+    <w:p>
+      <w:pPr>
         <w:pStyle w:val="Heading1"/>
       </w:pPr>
       <w:bookmarkStart w:id="3" w:name="_Toc190422317"/>
       <w:r>
-        <w:lastRenderedPageBreak/>
         <w:t>Technologies</w:t>
       </w:r>
       <w:bookmarkEnd w:id="3"/>
@@ -1963,6 +2451,7 @@
           <w:bCs/>
           <w:lang w:val="en-GB"/>
         </w:rPr>
+        <w:lastRenderedPageBreak/>
         <w:t>Ultralytics</w:t>
       </w:r>
       <w:proofErr w:type="spellEnd"/>
@@ -2210,7 +2699,6 @@
       </w:pPr>
       <w:bookmarkStart w:id="4" w:name="_Toc190422318"/>
       <w:r>
-        <w:lastRenderedPageBreak/>
         <w:t>Demo Site &amp; Company Site</w:t>
       </w:r>
       <w:bookmarkEnd w:id="4"/>
@@ -2299,6 +2787,7 @@
           <w:bCs/>
           <w:lang w:val="en-GB"/>
         </w:rPr>
+        <w:lastRenderedPageBreak/>
         <w:t>Default Settings</w:t>
       </w:r>
       <w:r>
@@ -2514,24 +3003,276 @@
       </w:pPr>
       <w:bookmarkStart w:id="7" w:name="_Toc190422321"/>
       <w:r>
+        <w:t xml:space="preserve">Personal Protective Equipment </w:t>
+      </w:r>
+      <w:r>
+        <w:t>Detection</w:t>
+      </w:r>
+      <w:bookmarkEnd w:id="7"/>
+    </w:p>
+    <w:p/>
+    <w:p>
+      <w:pPr>
+        <w:pStyle w:val="Heading2"/>
+      </w:pPr>
+      <w:bookmarkStart w:id="8" w:name="_Toc190422322"/>
+      <w:r>
+        <w:t>Helmet Detection</w:t>
+      </w:r>
+      <w:bookmarkEnd w:id="8"/>
+    </w:p>
+    <w:p/>
+    <w:p>
+      <w:pPr>
+        <w:rPr>
+          <w:lang w:val="en-GB"/>
+        </w:rPr>
+      </w:pPr>
+      <w:r>
+        <w:rPr>
+          <w:lang w:val="en-GB"/>
+        </w:rPr>
+        <w:t>Ensuring workers on construction sites wear helmets is critical for reducing the risk of head injuries caused by accidents or falling objects. The effectiveness of helmet detection using AI is one of the key features of this project, aligning with its objective of improving construction site safety. As such, selecting the most effective methodology for implementing helmet detection is a crucial design decision.</w:t>
+      </w:r>
+    </w:p>
+    <w:p>
+      <w:pPr>
+        <w:rPr>
+          <w:lang w:val="en-GB"/>
+        </w:rPr>
+      </w:pPr>
+      <w:r>
+        <w:rPr>
+          <w:lang w:val="en-GB"/>
+        </w:rPr>
         <w:lastRenderedPageBreak/>
-        <w:t xml:space="preserve">Personal Protective Equipment </w:t>
-      </w:r>
-      <w:r>
-        <w:t>Detection</w:t>
-      </w:r>
-      <w:bookmarkEnd w:id="7"/>
+        <w:t>Recent advancements in machine learning provide a strong foundation for this system’s design. Helmet detection primarily involves analysing visual input to identify key features of helmets on individuals in a live video feed. Techniques such as object detection using convolutional neural networks (CNNs) have proven effective in similar applications.</w:t>
+      </w:r>
+    </w:p>
+    <w:p>
+      <w:pPr>
+        <w:rPr>
+          <w:lang w:val="en-GB"/>
+        </w:rPr>
+      </w:pPr>
+      <w:r>
+        <w:rPr>
+          <w:lang w:val="en-GB"/>
+        </w:rPr>
+        <w:t>Focusing</w:t>
+      </w:r>
+      <w:r>
+        <w:rPr>
+          <w:lang w:val="en-GB"/>
+        </w:rPr>
+        <w:t xml:space="preserve"> on helmets allows for a more streamlined and accurate first iteration. For this reason, the initial implementation will prioriti</w:t>
+      </w:r>
+      <w:r>
+        <w:rPr>
+          <w:lang w:val="en-GB"/>
+        </w:rPr>
+        <w:t>s</w:t>
+      </w:r>
+      <w:r>
+        <w:rPr>
+          <w:lang w:val="en-GB"/>
+        </w:rPr>
+        <w:t>e helmet detection based on trained object detection models, such as YOLO (You Only Look Once), due to its speed and precision in real-time environments.</w:t>
+      </w:r>
+    </w:p>
+    <w:p>
+      <w:pPr>
+        <w:rPr>
+          <w:lang w:val="en-GB"/>
+        </w:rPr>
+      </w:pPr>
+      <w:r>
+        <w:rPr>
+          <w:lang w:val="en-GB"/>
+        </w:rPr>
+        <w:t xml:space="preserve">Subsequent iterations of the system </w:t>
+      </w:r>
+      <w:r>
+        <w:rPr>
+          <w:lang w:val="en-GB"/>
+        </w:rPr>
+        <w:t>will</w:t>
+      </w:r>
+      <w:r>
+        <w:rPr>
+          <w:lang w:val="en-GB"/>
+        </w:rPr>
+        <w:t xml:space="preserve"> expand to include </w:t>
+      </w:r>
+      <w:r>
+        <w:rPr>
+          <w:lang w:val="en-GB"/>
+        </w:rPr>
+        <w:t>high-visibility jackets</w:t>
+      </w:r>
+      <w:r>
+        <w:rPr>
+          <w:lang w:val="en-GB"/>
+        </w:rPr>
+        <w:t xml:space="preserve"> alongside helmets. </w:t>
+      </w:r>
+      <w:r>
+        <w:t>Research has shown that combining multiple safety indicators can significantly enhance the overall reliability of site safety systems (</w:t>
+      </w:r>
+      <w:r>
+        <w:t xml:space="preserve">Fig 4. </w:t>
+      </w:r>
+      <w:r>
+        <w:t>Work Health Safety Research, 2015).</w:t>
+      </w:r>
+      <w:r>
+        <w:rPr>
+          <w:lang w:val="en-GB"/>
+        </w:rPr>
+        <w:t xml:space="preserve"> </w:t>
+      </w:r>
+      <w:r>
+        <w:rPr>
+          <w:lang w:val="en-GB"/>
+        </w:rPr>
+        <w:t>By starting with helmets as the primary focus, this project aims to deliver high accuracy and responsiveness, laying the groundwork for broader functionality in future updates.</w:t>
+      </w:r>
     </w:p>
     <w:p/>
     <w:p>
       <w:pPr>
         <w:pStyle w:val="Heading2"/>
       </w:pPr>
-      <w:bookmarkStart w:id="8" w:name="_Toc190422322"/>
-      <w:r>
-        <w:t>Helmet Detection</w:t>
-      </w:r>
-      <w:bookmarkEnd w:id="8"/>
+      <w:bookmarkStart w:id="9" w:name="_Toc190422323"/>
+      <w:r>
+        <w:t>High-Visibility Jacket Detection</w:t>
+      </w:r>
+      <w:bookmarkEnd w:id="9"/>
+    </w:p>
+    <w:p>
+      <w:pPr>
+        <w:rPr>
+          <w:lang w:val="en-GB"/>
+        </w:rPr>
+      </w:pPr>
+    </w:p>
+    <w:p>
+      <w:pPr>
+        <w:rPr>
+          <w:lang w:val="en-GB"/>
+        </w:rPr>
+      </w:pPr>
+      <w:r>
+        <w:rPr>
+          <w:lang w:val="en-GB"/>
+        </w:rPr>
+        <w:t>The detection of high-visibility jackets is a vital component of ensuring worker compliance with safety regulations on construction sites. The chosen methodology for identifying high-visibility jackets relies on leveraging object detection models trained to recogni</w:t>
+      </w:r>
+      <w:r>
+        <w:rPr>
+          <w:lang w:val="en-GB"/>
+        </w:rPr>
+        <w:t>s</w:t>
+      </w:r>
+      <w:r>
+        <w:rPr>
+          <w:lang w:val="en-GB"/>
+        </w:rPr>
+        <w:t xml:space="preserve">e the unique </w:t>
+      </w:r>
+      <w:r>
+        <w:rPr>
+          <w:lang w:val="en-GB"/>
+        </w:rPr>
+        <w:t>colour</w:t>
+      </w:r>
+      <w:r>
+        <w:rPr>
+          <w:lang w:val="en-GB"/>
+        </w:rPr>
+        <w:t xml:space="preserve">, shape and </w:t>
+      </w:r>
+      <w:r>
+        <w:rPr>
+          <w:lang w:val="en-GB"/>
+        </w:rPr>
+        <w:t>reflective properties of such jackets.</w:t>
+      </w:r>
+    </w:p>
+    <w:p>
+      <w:pPr>
+        <w:rPr>
+          <w:lang w:val="en-GB"/>
+        </w:rPr>
+      </w:pPr>
+      <w:r>
+        <w:rPr>
+          <w:lang w:val="en-GB"/>
+        </w:rPr>
+        <w:t xml:space="preserve">Object detection libraries and frameworks provide the foundation for this functionality. Pretrained models like YOLO (You Only Look Once) have been evaluated for their suitability in identifying </w:t>
+      </w:r>
+      <w:r>
+        <w:rPr>
+          <w:lang w:val="en-GB"/>
+        </w:rPr>
+        <w:t>helmets, transitioning this to high-visibility jackets should be achievable.</w:t>
+      </w:r>
+      <w:r>
+        <w:rPr>
+          <w:lang w:val="en-GB"/>
+        </w:rPr>
+        <w:t xml:space="preserve"> YOLO is particularly advantageous due to its ability to process frames in real-time, a crucial feature for live video monitoring.</w:t>
+      </w:r>
+    </w:p>
+    <w:p>
+      <w:pPr>
+        <w:rPr>
+          <w:lang w:val="en-GB"/>
+        </w:rPr>
+      </w:pPr>
+      <w:r>
+        <w:rPr>
+          <w:lang w:val="en-GB"/>
+        </w:rPr>
+        <w:t xml:space="preserve">For initial implementation, YOLO will be employed for its speed and compatibility with a range of </w:t>
+      </w:r>
+      <w:r>
+        <w:rPr>
+          <w:lang w:val="en-GB"/>
+        </w:rPr>
+        <w:t>camera sources</w:t>
+      </w:r>
+      <w:r>
+        <w:rPr>
+          <w:lang w:val="en-GB"/>
+        </w:rPr>
+        <w:t xml:space="preserve">. The system will be trained using datasets containing diverse examples of high-visibility jackets across varying lighting and weather conditions to ensure robustness. One limitation of YOLO, however, is that its accuracy may decrease when distinguishing between jackets and similarly </w:t>
+      </w:r>
+      <w:r>
+        <w:rPr>
+          <w:lang w:val="en-GB"/>
+        </w:rPr>
+        <w:t>coloured</w:t>
+      </w:r>
+      <w:r>
+        <w:rPr>
+          <w:lang w:val="en-GB"/>
+        </w:rPr>
+        <w:t xml:space="preserve"> or reflective objects, which will be addressed through iterative model refinement.</w:t>
+      </w:r>
+    </w:p>
+    <w:p>
+      <w:pPr>
+        <w:pStyle w:val="Heading2"/>
+      </w:pPr>
+      <w:bookmarkStart w:id="10" w:name="_Toc190422324"/>
+      <w:r>
+        <w:t>Evaluation</w:t>
+      </w:r>
+      <w:r>
+        <w:t xml:space="preserve"> of detection model</w:t>
+      </w:r>
+      <w:bookmarkEnd w:id="10"/>
     </w:p>
     <w:p/>
     <w:p>
@@ -2544,39 +3285,19 @@
         <w:rPr>
           <w:lang w:val="en-GB"/>
         </w:rPr>
-        <w:t>Ensuring workers on construction sites wear helmets is critical for reducing the risk of head injuries caused by accidents or falling objects. The effectiveness of helmet detection using AI is one of the key features of this project, aligning with its objective of improving construction site safety. As such, selecting the most effective methodology for implementing helmet detection is a crucial design decision.</w:t>
-      </w:r>
-    </w:p>
-    <w:p>
-      <w:pPr>
-        <w:rPr>
-          <w:lang w:val="en-GB"/>
-        </w:rPr>
-      </w:pPr>
-      <w:r>
-        <w:rPr>
-          <w:lang w:val="en-GB"/>
-        </w:rPr>
-        <w:t>Recent advancements in machine learning provide a strong foundation for this system’s design. Helmet detection primarily involves analysing visual input to identify key features of helmets on individuals in a live video feed. Techniques such as object detection using convolutional neural networks (CNNs) have proven effective in similar applications.</w:t>
-      </w:r>
-    </w:p>
-    <w:p>
-      <w:pPr>
-        <w:rPr>
-          <w:lang w:val="en-GB"/>
-        </w:rPr>
-      </w:pPr>
-      <w:r>
-        <w:rPr>
-          <w:lang w:val="en-GB"/>
-        </w:rPr>
-        <w:t>Focusing</w:t>
-      </w:r>
-      <w:r>
-        <w:rPr>
-          <w:lang w:val="en-GB"/>
-        </w:rPr>
-        <w:t xml:space="preserve"> on helmets allows for a more streamlined and accurate first iteration. For this reason, the initial implementation will prioriti</w:t>
+        <w:t>The evaluation of detection models for helmets and high-visibility jackets will focus on key performance metrics to ensure the system meets safety monitoring standards. Metrics such as</w:t>
+      </w:r>
+      <w:r>
+        <w:rPr>
+          <w:lang w:val="en-GB"/>
+        </w:rPr>
+        <w:t xml:space="preserve"> confusion matrix,</w:t>
+      </w:r>
+      <w:r>
+        <w:rPr>
+          <w:lang w:val="en-GB"/>
+        </w:rPr>
+        <w:t xml:space="preserve"> precision, recall, and the F1-score will be used to assess the balance between the model's accuracy and its ability to minimi</w:t>
       </w:r>
       <w:r>
         <w:rPr>
@@ -2588,240 +3309,14 @@
         <w:rPr>
           <w:lang w:val="en-GB"/>
         </w:rPr>
-        <w:t>e helmet detection based on trained object detection models, such as YOLO (You Only Look Once), due to its speed and precision in real-time environments.</w:t>
-      </w:r>
-    </w:p>
-    <w:p>
-      <w:pPr>
-        <w:rPr>
-          <w:lang w:val="en-GB"/>
-        </w:rPr>
-      </w:pPr>
-      <w:r>
-        <w:rPr>
-          <w:lang w:val="en-GB"/>
-        </w:rPr>
-        <w:t xml:space="preserve">Subsequent iterations of the system </w:t>
-      </w:r>
-      <w:r>
-        <w:rPr>
-          <w:lang w:val="en-GB"/>
-        </w:rPr>
-        <w:t>will</w:t>
-      </w:r>
-      <w:r>
-        <w:rPr>
-          <w:lang w:val="en-GB"/>
-        </w:rPr>
-        <w:t xml:space="preserve"> expand to include </w:t>
-      </w:r>
-      <w:r>
-        <w:rPr>
-          <w:lang w:val="en-GB"/>
-        </w:rPr>
-        <w:t>high-visibility jackets</w:t>
-      </w:r>
-      <w:r>
-        <w:rPr>
-          <w:lang w:val="en-GB"/>
-        </w:rPr>
-        <w:t xml:space="preserve"> alongside helmets. </w:t>
-      </w:r>
-      <w:r>
-        <w:t>Research has shown that combining multiple safety indicators can significantly enhance the overall reliability of site safety systems (</w:t>
-      </w:r>
-      <w:r>
-        <w:t xml:space="preserve">Fig 4. </w:t>
-      </w:r>
-      <w:r>
-        <w:t>Work Health Safety Research, 2015).</w:t>
-      </w:r>
-      <w:r>
-        <w:rPr>
-          <w:lang w:val="en-GB"/>
-        </w:rPr>
-        <w:t xml:space="preserve"> </w:t>
-      </w:r>
-      <w:r>
-        <w:rPr>
-          <w:lang w:val="en-GB"/>
-        </w:rPr>
-        <w:t>By starting with helmets as the primary focus, this project aims to deliver high accuracy and responsiveness, laying the groundwork for broader functionality in future updates.</w:t>
-      </w:r>
-    </w:p>
-    <w:p/>
-    <w:p>
-      <w:pPr>
-        <w:pStyle w:val="Heading2"/>
-      </w:pPr>
-      <w:bookmarkStart w:id="9" w:name="_Toc190422323"/>
-      <w:r>
-        <w:t>High-Visibility Jacket Detection</w:t>
-      </w:r>
-      <w:bookmarkEnd w:id="9"/>
-    </w:p>
-    <w:p>
-      <w:pPr>
-        <w:rPr>
-          <w:lang w:val="en-GB"/>
-        </w:rPr>
-      </w:pPr>
-    </w:p>
-    <w:p>
-      <w:pPr>
-        <w:rPr>
-          <w:lang w:val="en-GB"/>
-        </w:rPr>
-      </w:pPr>
-      <w:r>
-        <w:rPr>
-          <w:lang w:val="en-GB"/>
-        </w:rPr>
-        <w:t>The detection of high-visibility jackets is a vital component of ensuring worker compliance with safety regulations on construction sites. The chosen methodology for identifying high-visibility jackets relies on leveraging object detection models trained to recogni</w:t>
-      </w:r>
-      <w:r>
-        <w:rPr>
-          <w:lang w:val="en-GB"/>
-        </w:rPr>
-        <w:t>s</w:t>
-      </w:r>
-      <w:r>
-        <w:rPr>
-          <w:lang w:val="en-GB"/>
-        </w:rPr>
-        <w:t xml:space="preserve">e the unique </w:t>
-      </w:r>
-      <w:r>
-        <w:rPr>
-          <w:lang w:val="en-GB"/>
-        </w:rPr>
-        <w:t>colour</w:t>
-      </w:r>
-      <w:r>
-        <w:rPr>
-          <w:lang w:val="en-GB"/>
-        </w:rPr>
-        <w:t xml:space="preserve">, shape and </w:t>
-      </w:r>
-      <w:r>
-        <w:rPr>
-          <w:lang w:val="en-GB"/>
-        </w:rPr>
-        <w:t>reflective properties of such jackets.</w:t>
-      </w:r>
-    </w:p>
-    <w:p>
-      <w:pPr>
-        <w:rPr>
-          <w:lang w:val="en-GB"/>
-        </w:rPr>
-      </w:pPr>
-      <w:r>
-        <w:rPr>
-          <w:lang w:val="en-GB"/>
-        </w:rPr>
-        <w:t xml:space="preserve">Object detection libraries and frameworks provide the foundation for this functionality. Pretrained models like YOLO (You Only Look Once) have been evaluated for their suitability in identifying </w:t>
-      </w:r>
-      <w:r>
-        <w:rPr>
-          <w:lang w:val="en-GB"/>
-        </w:rPr>
-        <w:t>helmets, transitioning this to high-visibility jackets should be achievable.</w:t>
-      </w:r>
-      <w:r>
-        <w:rPr>
-          <w:lang w:val="en-GB"/>
-        </w:rPr>
-        <w:t xml:space="preserve"> YOLO is particularly advantageous due to its ability to process frames in real-time, a crucial feature for live video monitoring.</w:t>
-      </w:r>
-    </w:p>
-    <w:p>
-      <w:pPr>
-        <w:rPr>
-          <w:lang w:val="en-GB"/>
-        </w:rPr>
-      </w:pPr>
+        <w:t xml:space="preserve">e false </w:t>
+      </w:r>
       <w:r>
         <w:rPr>
           <w:lang w:val="en-GB"/>
         </w:rPr>
         <w:lastRenderedPageBreak/>
-        <w:t xml:space="preserve">For initial implementation, YOLO will be employed for its speed and compatibility with a range of </w:t>
-      </w:r>
-      <w:r>
-        <w:rPr>
-          <w:lang w:val="en-GB"/>
-        </w:rPr>
-        <w:t>camera sources</w:t>
-      </w:r>
-      <w:r>
-        <w:rPr>
-          <w:lang w:val="en-GB"/>
-        </w:rPr>
-        <w:t xml:space="preserve">. The system will be trained using datasets containing diverse examples of high-visibility jackets across varying lighting and weather conditions to ensure robustness. One limitation of YOLO, however, is that its accuracy may decrease when distinguishing between jackets and similarly </w:t>
-      </w:r>
-      <w:r>
-        <w:rPr>
-          <w:lang w:val="en-GB"/>
-        </w:rPr>
-        <w:t>coloured</w:t>
-      </w:r>
-      <w:r>
-        <w:rPr>
-          <w:lang w:val="en-GB"/>
-        </w:rPr>
-        <w:t xml:space="preserve"> or reflective objects, which will be addressed through iterative model refinement.</w:t>
-      </w:r>
-    </w:p>
-    <w:p>
-      <w:pPr>
-        <w:pStyle w:val="Heading2"/>
-      </w:pPr>
-      <w:bookmarkStart w:id="10" w:name="_Toc190422324"/>
-      <w:r>
-        <w:t>Evaluation</w:t>
-      </w:r>
-      <w:r>
-        <w:t xml:space="preserve"> of detection model</w:t>
-      </w:r>
-      <w:bookmarkEnd w:id="10"/>
-    </w:p>
-    <w:p/>
-    <w:p>
-      <w:pPr>
-        <w:rPr>
-          <w:lang w:val="en-GB"/>
-        </w:rPr>
-      </w:pPr>
-      <w:r>
-        <w:rPr>
-          <w:lang w:val="en-GB"/>
-        </w:rPr>
-        <w:t>The evaluation of detection models for helmets and high-visibility jackets will focus on key performance metrics to ensure the system meets safety monitoring standards. Metrics such as</w:t>
-      </w:r>
-      <w:r>
-        <w:rPr>
-          <w:lang w:val="en-GB"/>
-        </w:rPr>
-        <w:t xml:space="preserve"> confusion matrix,</w:t>
-      </w:r>
-      <w:r>
-        <w:rPr>
-          <w:lang w:val="en-GB"/>
-        </w:rPr>
-        <w:t xml:space="preserve"> precision, recall, and the F1-score will be used to assess the balance between the model's accuracy and its ability to minimi</w:t>
-      </w:r>
-      <w:r>
-        <w:rPr>
-          <w:lang w:val="en-GB"/>
-        </w:rPr>
-        <w:t>s</w:t>
-      </w:r>
-      <w:r>
-        <w:rPr>
-          <w:lang w:val="en-GB"/>
-        </w:rPr>
-        <w:t>e false positives and false negatives. A confusion matrix will provide a detailed breakdown of true positives, false positives, true negatives, and false negatives, offering insights into areas of improvement for the model.</w:t>
+        <w:t>positives and false negatives. A confusion matrix will provide a detailed breakdown of true positives, false positives, true negatives, and false negatives, offering insights into areas of improvement for the model.</w:t>
       </w:r>
     </w:p>
     <w:p>
@@ -2962,7 +3457,7 @@
                     </pic:cNvPicPr>
                   </pic:nvPicPr>
                   <pic:blipFill>
-                    <a:blip r:embed="rId14" cstate="print">
+                    <a:blip r:embed="rId18" cstate="print">
                       <a:extLst>
                         <a:ext uri="{28A0092B-C50C-407E-A947-70E740481C1C}">
                           <a14:useLocalDpi xmlns:a14="http://schemas.microsoft.com/office/drawing/2010/main" val="0"/>
@@ -3068,7 +3563,6 @@
         <w:rPr>
           <w:noProof/>
         </w:rPr>
-        <w:lastRenderedPageBreak/>
         <w:drawing>
           <wp:anchor distT="0" distB="0" distL="114300" distR="114300" simplePos="0" relativeHeight="251802624" behindDoc="0" locked="0" layoutInCell="1" allowOverlap="1" wp14:anchorId="2B88D112" wp14:editId="6A698C96">
             <wp:simplePos x="0" y="0"/>
@@ -3095,7 +3589,7 @@
                     </pic:cNvPicPr>
                   </pic:nvPicPr>
                   <pic:blipFill>
-                    <a:blip r:embed="rId15" cstate="print">
+                    <a:blip r:embed="rId19" cstate="print">
                       <a:extLst>
                         <a:ext uri="{28A0092B-C50C-407E-A947-70E740481C1C}">
                           <a14:useLocalDpi xmlns:a14="http://schemas.microsoft.com/office/drawing/2010/main" val="0"/>
@@ -3283,7 +3777,7 @@
                     </pic:cNvPicPr>
                   </pic:nvPicPr>
                   <pic:blipFill>
-                    <a:blip r:embed="rId16" cstate="print">
+                    <a:blip r:embed="rId20" cstate="print">
                       <a:extLst>
                         <a:ext uri="{28A0092B-C50C-407E-A947-70E740481C1C}">
                           <a14:useLocalDpi xmlns:a14="http://schemas.microsoft.com/office/drawing/2010/main" val="0"/>
@@ -3361,7 +3855,7 @@
                     </pic:cNvPicPr>
                   </pic:nvPicPr>
                   <pic:blipFill>
-                    <a:blip r:embed="rId17" cstate="print">
+                    <a:blip r:embed="rId21" cstate="print">
                       <a:extLst>
                         <a:ext uri="{28A0092B-C50C-407E-A947-70E740481C1C}">
                           <a14:useLocalDpi xmlns:a14="http://schemas.microsoft.com/office/drawing/2010/main" val="0"/>
@@ -3438,7 +3932,7 @@
                     </pic:cNvPicPr>
                   </pic:nvPicPr>
                   <pic:blipFill>
-                    <a:blip r:embed="rId18" cstate="print">
+                    <a:blip r:embed="rId22" cstate="print">
                       <a:extLst>
                         <a:ext uri="{28A0092B-C50C-407E-A947-70E740481C1C}">
                           <a14:useLocalDpi xmlns:a14="http://schemas.microsoft.com/office/drawing/2010/main" val="0"/>
@@ -3773,7 +4267,7 @@
           <w:lang w:val="en-GB"/>
         </w:rPr>
         <w:drawing>
-          <wp:anchor distT="0" distB="0" distL="114300" distR="114300" simplePos="0" relativeHeight="251804672" behindDoc="0" locked="0" layoutInCell="1" allowOverlap="1" wp14:anchorId="69356E40" wp14:editId="0587C780">
+          <wp:anchor distT="0" distB="0" distL="114300" distR="114300" simplePos="0" relativeHeight="251804672" behindDoc="0" locked="0" layoutInCell="1" allowOverlap="1" wp14:anchorId="69356E40" wp14:editId="78337639">
             <wp:simplePos x="0" y="0"/>
             <wp:positionH relativeFrom="column">
               <wp:posOffset>-441960</wp:posOffset>
@@ -3798,7 +4292,7 @@
                     </pic:cNvPicPr>
                   </pic:nvPicPr>
                   <pic:blipFill>
-                    <a:blip r:embed="rId19" cstate="print">
+                    <a:blip r:embed="rId23" cstate="print">
                       <a:extLst>
                         <a:ext uri="{28A0092B-C50C-407E-A947-70E740481C1C}">
                           <a14:useLocalDpi xmlns:a14="http://schemas.microsoft.com/office/drawing/2010/main" val="0"/>
@@ -3966,7 +4460,7 @@
                     </pic:cNvPicPr>
                   </pic:nvPicPr>
                   <pic:blipFill>
-                    <a:blip r:embed="rId20" cstate="print">
+                    <a:blip r:embed="rId24" cstate="print">
                       <a:extLst>
                         <a:ext uri="{28A0092B-C50C-407E-A947-70E740481C1C}">
                           <a14:useLocalDpi xmlns:a14="http://schemas.microsoft.com/office/drawing/2010/main" val="0"/>
@@ -4873,7 +5367,7 @@
                     </pic:cNvPicPr>
                   </pic:nvPicPr>
                   <pic:blipFill>
-                    <a:blip r:embed="rId21">
+                    <a:blip r:embed="rId25">
                       <a:extLst>
                         <a:ext uri="{28A0092B-C50C-407E-A947-70E740481C1C}">
                           <a14:useLocalDpi xmlns:a14="http://schemas.microsoft.com/office/drawing/2010/main" val="0"/>
@@ -4959,7 +5453,7 @@
             <wp:cNvGraphicFramePr/>
             <a:graphic xmlns:a="http://schemas.openxmlformats.org/drawingml/2006/main">
               <a:graphicData uri="http://schemas.openxmlformats.org/drawingml/2006/diagram">
-                <dgm:relIds xmlns:dgm="http://schemas.openxmlformats.org/drawingml/2006/diagram" xmlns:r="http://schemas.openxmlformats.org/officeDocument/2006/relationships" r:dm="rId22" r:lo="rId23" r:qs="rId24" r:cs="rId25"/>
+                <dgm:relIds xmlns:dgm="http://schemas.openxmlformats.org/drawingml/2006/diagram" xmlns:r="http://schemas.openxmlformats.org/officeDocument/2006/relationships" r:dm="rId26" r:lo="rId27" r:qs="rId28" r:cs="rId29"/>
               </a:graphicData>
             </a:graphic>
           </wp:inline>
@@ -4996,7 +5490,7 @@
             <wp:cNvGraphicFramePr/>
             <a:graphic xmlns:a="http://schemas.openxmlformats.org/drawingml/2006/main">
               <a:graphicData uri="http://schemas.openxmlformats.org/drawingml/2006/diagram">
-                <dgm:relIds xmlns:dgm="http://schemas.openxmlformats.org/drawingml/2006/diagram" xmlns:r="http://schemas.openxmlformats.org/officeDocument/2006/relationships" r:dm="rId27" r:lo="rId28" r:qs="rId29" r:cs="rId30"/>
+                <dgm:relIds xmlns:dgm="http://schemas.openxmlformats.org/drawingml/2006/diagram" xmlns:r="http://schemas.openxmlformats.org/officeDocument/2006/relationships" r:dm="rId31" r:lo="rId32" r:qs="rId33" r:cs="rId34"/>
               </a:graphicData>
             </a:graphic>
           </wp:inline>
@@ -5033,7 +5527,7 @@
             <wp:cNvGraphicFramePr/>
             <a:graphic xmlns:a="http://schemas.openxmlformats.org/drawingml/2006/main">
               <a:graphicData uri="http://schemas.openxmlformats.org/drawingml/2006/diagram">
-                <dgm:relIds xmlns:dgm="http://schemas.openxmlformats.org/drawingml/2006/diagram" xmlns:r="http://schemas.openxmlformats.org/officeDocument/2006/relationships" r:dm="rId32" r:lo="rId33" r:qs="rId34" r:cs="rId35"/>
+                <dgm:relIds xmlns:dgm="http://schemas.openxmlformats.org/drawingml/2006/diagram" xmlns:r="http://schemas.openxmlformats.org/officeDocument/2006/relationships" r:dm="rId36" r:lo="rId37" r:qs="rId38" r:cs="rId39"/>
               </a:graphicData>
             </a:graphic>
           </wp:inline>
@@ -5070,7 +5564,7 @@
             <wp:cNvGraphicFramePr/>
             <a:graphic xmlns:a="http://schemas.openxmlformats.org/drawingml/2006/main">
               <a:graphicData uri="http://schemas.openxmlformats.org/drawingml/2006/diagram">
-                <dgm:relIds xmlns:dgm="http://schemas.openxmlformats.org/drawingml/2006/diagram" xmlns:r="http://schemas.openxmlformats.org/officeDocument/2006/relationships" r:dm="rId37" r:lo="rId38" r:qs="rId39" r:cs="rId40"/>
+                <dgm:relIds xmlns:dgm="http://schemas.openxmlformats.org/drawingml/2006/diagram" xmlns:r="http://schemas.openxmlformats.org/officeDocument/2006/relationships" r:dm="rId41" r:lo="rId42" r:qs="rId43" r:cs="rId44"/>
               </a:graphicData>
             </a:graphic>
           </wp:inline>
@@ -5165,7 +5659,7 @@
                     </pic:cNvPicPr>
                   </pic:nvPicPr>
                   <pic:blipFill>
-                    <a:blip r:embed="rId42" cstate="print">
+                    <a:blip r:embed="rId46" cstate="print">
                       <a:extLst>
                         <a:ext uri="{28A0092B-C50C-407E-A947-70E740481C1C}">
                           <a14:useLocalDpi xmlns:a14="http://schemas.microsoft.com/office/drawing/2010/main" val="0"/>
@@ -5243,7 +5737,7 @@
                     </pic:cNvPicPr>
                   </pic:nvPicPr>
                   <pic:blipFill>
-                    <a:blip r:embed="rId43" cstate="print">
+                    <a:blip r:embed="rId47" cstate="print">
                       <a:extLst>
                         <a:ext uri="{28A0092B-C50C-407E-A947-70E740481C1C}">
                           <a14:useLocalDpi xmlns:a14="http://schemas.microsoft.com/office/drawing/2010/main" val="0"/>
@@ -5315,7 +5809,7 @@
                     </pic:cNvPicPr>
                   </pic:nvPicPr>
                   <pic:blipFill>
-                    <a:blip r:embed="rId44" cstate="print">
+                    <a:blip r:embed="rId48" cstate="print">
                       <a:extLst>
                         <a:ext uri="{28A0092B-C50C-407E-A947-70E740481C1C}">
                           <a14:useLocalDpi xmlns:a14="http://schemas.microsoft.com/office/drawing/2010/main" val="0"/>
@@ -5390,7 +5884,7 @@
                     </pic:cNvPicPr>
                   </pic:nvPicPr>
                   <pic:blipFill>
-                    <a:blip r:embed="rId45" cstate="print">
+                    <a:blip r:embed="rId49" cstate="print">
                       <a:extLst>
                         <a:ext uri="{28A0092B-C50C-407E-A947-70E740481C1C}">
                           <a14:useLocalDpi xmlns:a14="http://schemas.microsoft.com/office/drawing/2010/main" val="0"/>
@@ -5465,7 +5959,7 @@
                     </pic:cNvPicPr>
                   </pic:nvPicPr>
                   <pic:blipFill>
-                    <a:blip r:embed="rId46" cstate="print">
+                    <a:blip r:embed="rId50" cstate="print">
                       <a:extLst>
                         <a:ext uri="{28A0092B-C50C-407E-A947-70E740481C1C}">
                           <a14:useLocalDpi xmlns:a14="http://schemas.microsoft.com/office/drawing/2010/main" val="0"/>
@@ -5524,7 +6018,7 @@
                     </pic:cNvPicPr>
                   </pic:nvPicPr>
                   <pic:blipFill>
-                    <a:blip r:embed="rId47" cstate="print">
+                    <a:blip r:embed="rId51" cstate="print">
                       <a:extLst>
                         <a:ext uri="{28A0092B-C50C-407E-A947-70E740481C1C}">
                           <a14:useLocalDpi xmlns:a14="http://schemas.microsoft.com/office/drawing/2010/main" val="0"/>
@@ -5598,7 +6092,7 @@
                     </pic:cNvPicPr>
                   </pic:nvPicPr>
                   <pic:blipFill>
-                    <a:blip r:embed="rId48" cstate="print">
+                    <a:blip r:embed="rId52" cstate="print">
                       <a:extLst>
                         <a:ext uri="{28A0092B-C50C-407E-A947-70E740481C1C}">
                           <a14:useLocalDpi xmlns:a14="http://schemas.microsoft.com/office/drawing/2010/main" val="0"/>
@@ -5665,7 +6159,7 @@
                     </pic:cNvPicPr>
                   </pic:nvPicPr>
                   <pic:blipFill>
-                    <a:blip r:embed="rId49" cstate="print">
+                    <a:blip r:embed="rId53" cstate="print">
                       <a:extLst>
                         <a:ext uri="{28A0092B-C50C-407E-A947-70E740481C1C}">
                           <a14:useLocalDpi xmlns:a14="http://schemas.microsoft.com/office/drawing/2010/main" val="0"/>
@@ -5744,7 +6238,7 @@
                     </pic:cNvPicPr>
                   </pic:nvPicPr>
                   <pic:blipFill>
-                    <a:blip r:embed="rId50">
+                    <a:blip r:embed="rId54">
                       <a:extLst>
                         <a:ext uri="{28A0092B-C50C-407E-A947-70E740481C1C}">
                           <a14:useLocalDpi xmlns:a14="http://schemas.microsoft.com/office/drawing/2010/main" val="0"/>
@@ -5972,7 +6466,7 @@
                     </pic:cNvPicPr>
                   </pic:nvPicPr>
                   <pic:blipFill>
-                    <a:blip r:embed="rId51">
+                    <a:blip r:embed="rId55">
                       <a:extLst>
                         <a:ext uri="{28A0092B-C50C-407E-A947-70E740481C1C}">
                           <a14:useLocalDpi xmlns:a14="http://schemas.microsoft.com/office/drawing/2010/main" val="0"/>
@@ -6186,7 +6680,7 @@
                     </pic:cNvPicPr>
                   </pic:nvPicPr>
                   <pic:blipFill>
-                    <a:blip r:embed="rId52">
+                    <a:blip r:embed="rId56">
                       <a:extLst>
                         <a:ext uri="{28A0092B-C50C-407E-A947-70E740481C1C}">
                           <a14:useLocalDpi xmlns:a14="http://schemas.microsoft.com/office/drawing/2010/main" val="0"/>
@@ -6371,7 +6865,7 @@
                     </pic:cNvPicPr>
                   </pic:nvPicPr>
                   <pic:blipFill>
-                    <a:blip r:embed="rId53">
+                    <a:blip r:embed="rId57">
                       <a:extLst>
                         <a:ext uri="{28A0092B-C50C-407E-A947-70E740481C1C}">
                           <a14:useLocalDpi xmlns:a14="http://schemas.microsoft.com/office/drawing/2010/main" val="0"/>
@@ -6564,7 +7058,7 @@
                     </pic:cNvPicPr>
                   </pic:nvPicPr>
                   <pic:blipFill>
-                    <a:blip r:embed="rId54">
+                    <a:blip r:embed="rId58">
                       <a:extLst>
                         <a:ext uri="{28A0092B-C50C-407E-A947-70E740481C1C}">
                           <a14:useLocalDpi xmlns:a14="http://schemas.microsoft.com/office/drawing/2010/main" val="0"/>
@@ -6663,7 +7157,7 @@
                     </pic:cNvPicPr>
                   </pic:nvPicPr>
                   <pic:blipFill>
-                    <a:blip r:embed="rId55">
+                    <a:blip r:embed="rId59">
                       <a:extLst>
                         <a:ext uri="{28A0092B-C50C-407E-A947-70E740481C1C}">
                           <a14:useLocalDpi xmlns:a14="http://schemas.microsoft.com/office/drawing/2010/main" val="0"/>
@@ -6937,7 +7431,7 @@
                     <pic:cNvPicPr/>
                   </pic:nvPicPr>
                   <pic:blipFill>
-                    <a:blip r:embed="rId56">
+                    <a:blip r:embed="rId60">
                       <a:extLst>
                         <a:ext uri="{28A0092B-C50C-407E-A947-70E740481C1C}">
                           <a14:useLocalDpi xmlns:a14="http://schemas.microsoft.com/office/drawing/2010/main" val="0"/>
@@ -7295,7 +7789,7 @@
                     <pic:cNvPicPr/>
                   </pic:nvPicPr>
                   <pic:blipFill>
-                    <a:blip r:embed="rId57">
+                    <a:blip r:embed="rId61">
                       <a:extLst>
                         <a:ext uri="{28A0092B-C50C-407E-A947-70E740481C1C}">
                           <a14:useLocalDpi xmlns:a14="http://schemas.microsoft.com/office/drawing/2010/main" val="0"/>
@@ -7381,7 +7875,7 @@
                     <pic:cNvPicPr/>
                   </pic:nvPicPr>
                   <pic:blipFill>
-                    <a:blip r:embed="rId58">
+                    <a:blip r:embed="rId62">
                       <a:extLst>
                         <a:ext uri="{28A0092B-C50C-407E-A947-70E740481C1C}">
                           <a14:useLocalDpi xmlns:a14="http://schemas.microsoft.com/office/drawing/2010/main" val="0"/>
@@ -7441,7 +7935,7 @@
                     <pic:cNvPicPr/>
                   </pic:nvPicPr>
                   <pic:blipFill>
-                    <a:blip r:embed="rId59">
+                    <a:blip r:embed="rId63">
                       <a:extLst>
                         <a:ext uri="{28A0092B-C50C-407E-A947-70E740481C1C}">
                           <a14:useLocalDpi xmlns:a14="http://schemas.microsoft.com/office/drawing/2010/main" val="0"/>
@@ -7508,7 +8002,7 @@
                     <pic:cNvPicPr/>
                   </pic:nvPicPr>
                   <pic:blipFill>
-                    <a:blip r:embed="rId60">
+                    <a:blip r:embed="rId64">
                       <a:extLst>
                         <a:ext uri="{28A0092B-C50C-407E-A947-70E740481C1C}">
                           <a14:useLocalDpi xmlns:a14="http://schemas.microsoft.com/office/drawing/2010/main" val="0"/>
@@ -7611,7 +8105,7 @@
         </w:rPr>
         <w:t xml:space="preserve">Fig 1. SETU Logo: </w:t>
       </w:r>
-      <w:hyperlink r:id="rId61" w:tgtFrame="_new" w:history="1">
+      <w:hyperlink r:id="rId65" w:tgtFrame="_new" w:history="1">
         <w:r>
           <w:rPr>
             <w:rStyle w:val="Hyperlink"/>
@@ -7663,7 +8157,7 @@
         </w:rPr>
         <w:t xml:space="preserve"> </w:t>
       </w:r>
-      <w:hyperlink r:id="rId62" w:history="1">
+      <w:hyperlink r:id="rId66" w:history="1">
         <w:r>
           <w:rPr>
             <w:rStyle w:val="Hyperlink"/>
@@ -7697,7 +8191,7 @@
         </w:rPr>
         <w:t xml:space="preserve">: </w:t>
       </w:r>
-      <w:hyperlink r:id="rId63" w:history="1">
+      <w:hyperlink r:id="rId67" w:history="1">
         <w:r>
           <w:rPr>
             <w:rStyle w:val="Hyperlink"/>
@@ -7735,7 +8229,7 @@
         </w:rPr>
         <w:t xml:space="preserve">: </w:t>
       </w:r>
-      <w:hyperlink r:id="rId64" w:history="1">
+      <w:hyperlink r:id="rId68" w:history="1">
         <w:r>
           <w:rPr>
             <w:rStyle w:val="Hyperlink"/>
@@ -7751,7 +8245,7 @@
       <w:r>
         <w:t xml:space="preserve">Fig 5. YOLO Training Code: </w:t>
       </w:r>
-      <w:hyperlink r:id="rId65" w:history="1">
+      <w:hyperlink r:id="rId69" w:history="1">
         <w:r>
           <w:rPr>
             <w:rStyle w:val="Hyperlink"/>
@@ -7809,7 +8303,7 @@
         </w:rPr>
         <w:t xml:space="preserve"> </w:t>
       </w:r>
-      <w:hyperlink r:id="rId66" w:tgtFrame="_new" w:history="1">
+      <w:hyperlink r:id="rId70" w:tgtFrame="_new" w:history="1">
         <w:r>
           <w:rPr>
             <w:rStyle w:val="Hyperlink"/>
@@ -7856,7 +8350,7 @@
         </w:rPr>
         <w:t xml:space="preserve"> </w:t>
       </w:r>
-      <w:hyperlink r:id="rId67" w:history="1">
+      <w:hyperlink r:id="rId71" w:history="1">
         <w:r>
           <w:rPr>
             <w:rStyle w:val="Hyperlink"/>
@@ -7899,7 +8393,7 @@
         </w:rPr>
         <w:t xml:space="preserve">: </w:t>
       </w:r>
-      <w:hyperlink r:id="rId68" w:history="1">
+      <w:hyperlink r:id="rId72" w:history="1">
         <w:r>
           <w:rPr>
             <w:rStyle w:val="Hyperlink"/>
@@ -7940,7 +8434,7 @@
         </w:rPr>
         <w:t xml:space="preserve">: </w:t>
       </w:r>
-      <w:hyperlink r:id="rId69" w:history="1">
+      <w:hyperlink r:id="rId73" w:history="1">
         <w:r>
           <w:rPr>
             <w:rStyle w:val="Hyperlink"/>
@@ -7981,7 +8475,7 @@
         </w:rPr>
         <w:t xml:space="preserve">: </w:t>
       </w:r>
-      <w:hyperlink r:id="rId70" w:history="1">
+      <w:hyperlink r:id="rId74" w:history="1">
         <w:r>
           <w:rPr>
             <w:rStyle w:val="Hyperlink"/>
@@ -8022,7 +8516,7 @@
         </w:rPr>
         <w:t xml:space="preserve">: </w:t>
       </w:r>
-      <w:hyperlink r:id="rId71" w:history="1">
+      <w:hyperlink r:id="rId75" w:history="1">
         <w:r>
           <w:rPr>
             <w:rStyle w:val="Hyperlink"/>
@@ -8069,7 +8563,7 @@
         </w:rPr>
         <w:t xml:space="preserve"> </w:t>
       </w:r>
-      <w:hyperlink r:id="rId72" w:history="1">
+      <w:hyperlink r:id="rId76" w:history="1">
         <w:r>
           <w:rPr>
             <w:rStyle w:val="Hyperlink"/>
@@ -8118,7 +8612,7 @@
         </w:rPr>
         <w:t xml:space="preserve"> </w:t>
       </w:r>
-      <w:hyperlink r:id="rId73" w:tgtFrame="_new" w:history="1">
+      <w:hyperlink r:id="rId77" w:tgtFrame="_new" w:history="1">
         <w:r>
           <w:rPr>
             <w:rStyle w:val="Hyperlink"/>
@@ -8133,7 +8627,7 @@
     <w:p/>
     <w:p/>
     <w:sectPr>
-      <w:footerReference w:type="default" r:id="rId74"/>
+      <w:footerReference w:type="default" r:id="rId78"/>
       <w:pgSz w:w="11906" w:h="16838"/>
       <w:pgMar w:top="1440" w:right="1440" w:bottom="1440" w:left="1440" w:header="708" w:footer="708" w:gutter="0"/>
       <w:pgBorders w:offsetFrom="page">
@@ -16534,7 +17028,7 @@
   <dgm:whole/>
   <dgm:extLst>
     <a:ext uri="http://schemas.microsoft.com/office/drawing/2008/diagram">
-      <dsp:dataModelExt xmlns:dsp="http://schemas.microsoft.com/office/drawing/2008/diagram" relId="rId26" minVer="http://schemas.openxmlformats.org/drawingml/2006/diagram"/>
+      <dsp:dataModelExt xmlns:dsp="http://schemas.microsoft.com/office/drawing/2008/diagram" relId="rId30" minVer="http://schemas.openxmlformats.org/drawingml/2006/diagram"/>
     </a:ext>
   </dgm:extLst>
 </dgm:dataModel>
@@ -17155,7 +17649,7 @@
   <dgm:whole/>
   <dgm:extLst>
     <a:ext uri="http://schemas.microsoft.com/office/drawing/2008/diagram">
-      <dsp:dataModelExt xmlns:dsp="http://schemas.microsoft.com/office/drawing/2008/diagram" relId="rId31" minVer="http://schemas.openxmlformats.org/drawingml/2006/diagram"/>
+      <dsp:dataModelExt xmlns:dsp="http://schemas.microsoft.com/office/drawing/2008/diagram" relId="rId35" minVer="http://schemas.openxmlformats.org/drawingml/2006/diagram"/>
     </a:ext>
   </dgm:extLst>
 </dgm:dataModel>
@@ -17441,7 +17935,7 @@
   <dgm:whole/>
   <dgm:extLst>
     <a:ext uri="http://schemas.microsoft.com/office/drawing/2008/diagram">
-      <dsp:dataModelExt xmlns:dsp="http://schemas.microsoft.com/office/drawing/2008/diagram" relId="rId36" minVer="http://schemas.openxmlformats.org/drawingml/2006/diagram"/>
+      <dsp:dataModelExt xmlns:dsp="http://schemas.microsoft.com/office/drawing/2008/diagram" relId="rId40" minVer="http://schemas.openxmlformats.org/drawingml/2006/diagram"/>
     </a:ext>
   </dgm:extLst>
 </dgm:dataModel>
@@ -17963,7 +18457,7 @@
   <dgm:whole/>
   <dgm:extLst>
     <a:ext uri="http://schemas.microsoft.com/office/drawing/2008/diagram">
-      <dsp:dataModelExt xmlns:dsp="http://schemas.microsoft.com/office/drawing/2008/diagram" relId="rId41" minVer="http://schemas.openxmlformats.org/drawingml/2006/diagram"/>
+      <dsp:dataModelExt xmlns:dsp="http://schemas.microsoft.com/office/drawing/2008/diagram" relId="rId45" minVer="http://schemas.openxmlformats.org/drawingml/2006/diagram"/>
     </a:ext>
   </dgm:extLst>
 </dgm:dataModel>
@@ -26123,6 +26617,23 @@
 </file>
 
 <file path=customXml/item1.xml><?xml version="1.0" encoding="utf-8"?>
+<?mso-contentType ?>
+<FormTemplates xmlns="http://schemas.microsoft.com/sharepoint/v3/contenttype/forms">
+  <Display>DocumentLibraryForm</Display>
+  <Edit>DocumentLibraryForm</Edit>
+  <New>DocumentLibraryForm</New>
+</FormTemplates>
+</file>
+
+<file path=customXml/item2.xml><?xml version="1.0" encoding="utf-8"?>
+<p:properties xmlns:p="http://schemas.microsoft.com/office/2006/metadata/properties" xmlns:xsi="http://www.w3.org/2001/XMLSchema-instance" xmlns:pc="http://schemas.microsoft.com/office/infopath/2007/PartnerControls">
+  <documentManagement>
+    <_activity xmlns="d71ff2ac-62c7-44d6-abd7-1383af8796a8" xsi:nil="true"/>
+  </documentManagement>
+</p:properties>
+</file>
+
+<file path=customXml/item3.xml><?xml version="1.0" encoding="utf-8"?>
 <ct:contentTypeSchema xmlns:ct="http://schemas.microsoft.com/office/2006/metadata/contentType" xmlns:ma="http://schemas.microsoft.com/office/2006/metadata/properties/metaAttributes" ct:_="" ma:_="" ma:contentTypeName="Document" ma:contentTypeID="0x0101009908F051F1A7FA40B6E0D78DFA896E6F" ma:contentTypeVersion="15" ma:contentTypeDescription="Create a new document." ma:contentTypeScope="" ma:versionID="16bd8ccdb24192f5a23e1f50082beb91">
   <xsd:schema xmlns:xsd="http://www.w3.org/2001/XMLSchema" xmlns:xs="http://www.w3.org/2001/XMLSchema" xmlns:p="http://schemas.microsoft.com/office/2006/metadata/properties" xmlns:ns3="d71ff2ac-62c7-44d6-abd7-1383af8796a8" xmlns:ns4="19621f95-9056-4b81-ab21-41233ae0d36d" targetNamespace="http://schemas.microsoft.com/office/2006/metadata/properties" ma:root="true" ma:fieldsID="4a6057a7fc35ca9381604f182b6a209d" ns3:_="" ns4:_="">
     <xsd:import namespace="d71ff2ac-62c7-44d6-abd7-1383af8796a8"/>
@@ -26355,28 +26866,29 @@
 </ct:contentTypeSchema>
 </file>
 
-<file path=customXml/item2.xml><?xml version="1.0" encoding="utf-8"?>
-<?mso-contentType ?>
-<FormTemplates xmlns="http://schemas.microsoft.com/sharepoint/v3/contenttype/forms">
-  <Display>DocumentLibraryForm</Display>
-  <Edit>DocumentLibraryForm</Edit>
-  <New>DocumentLibraryForm</New>
-</FormTemplates>
-</file>
-
-<file path=customXml/item3.xml><?xml version="1.0" encoding="utf-8"?>
-<p:properties xmlns:p="http://schemas.microsoft.com/office/2006/metadata/properties" xmlns:xsi="http://www.w3.org/2001/XMLSchema-instance" xmlns:pc="http://schemas.microsoft.com/office/infopath/2007/PartnerControls">
-  <documentManagement>
-    <_activity xmlns="d71ff2ac-62c7-44d6-abd7-1383af8796a8" xsi:nil="true"/>
-  </documentManagement>
-</p:properties>
-</file>
-
 <file path=customXml/item4.xml><?xml version="1.0" encoding="utf-8"?>
 <b:Sources xmlns:b="http://schemas.openxmlformats.org/officeDocument/2006/bibliography" xmlns="http://schemas.openxmlformats.org/officeDocument/2006/bibliography" SelectedStyle="\APASixthEditionOfficeOnline.xsl" StyleName="APA" Version="6"/>
 </file>
 
 <file path=customXml/itemProps1.xml><?xml version="1.0" encoding="utf-8"?>
+<ds:datastoreItem xmlns:ds="http://schemas.openxmlformats.org/officeDocument/2006/customXml" ds:itemID="{DBC131DF-4F18-448B-B46F-936BB86E1BD6}">
+  <ds:schemaRefs>
+    <ds:schemaRef ds:uri="http://schemas.microsoft.com/sharepoint/v3/contenttype/forms"/>
+  </ds:schemaRefs>
+</ds:datastoreItem>
+</file>
+
+<file path=customXml/itemProps2.xml><?xml version="1.0" encoding="utf-8"?>
+<ds:datastoreItem xmlns:ds="http://schemas.openxmlformats.org/officeDocument/2006/customXml" ds:itemID="{3F2AE3CF-AF0A-42C7-BC75-AAA91D189F19}">
+  <ds:schemaRefs>
+    <ds:schemaRef ds:uri="http://schemas.microsoft.com/office/2006/metadata/properties"/>
+    <ds:schemaRef ds:uri="http://schemas.microsoft.com/office/infopath/2007/PartnerControls"/>
+    <ds:schemaRef ds:uri="d71ff2ac-62c7-44d6-abd7-1383af8796a8"/>
+  </ds:schemaRefs>
+</ds:datastoreItem>
+</file>
+
+<file path=customXml/itemProps3.xml><?xml version="1.0" encoding="utf-8"?>
 <ds:datastoreItem xmlns:ds="http://schemas.openxmlformats.org/officeDocument/2006/customXml" ds:itemID="{9E4FD10E-ECE4-47FC-B486-A980A4B50C09}">
   <ds:schemaRefs>
     <ds:schemaRef ds:uri="http://schemas.microsoft.com/office/2006/metadata/contentType"/>
@@ -26395,24 +26907,6 @@
 </ds:datastoreItem>
 </file>
 
-<file path=customXml/itemProps2.xml><?xml version="1.0" encoding="utf-8"?>
-<ds:datastoreItem xmlns:ds="http://schemas.openxmlformats.org/officeDocument/2006/customXml" ds:itemID="{DBC131DF-4F18-448B-B46F-936BB86E1BD6}">
-  <ds:schemaRefs>
-    <ds:schemaRef ds:uri="http://schemas.microsoft.com/sharepoint/v3/contenttype/forms"/>
-  </ds:schemaRefs>
-</ds:datastoreItem>
-</file>
-
-<file path=customXml/itemProps3.xml><?xml version="1.0" encoding="utf-8"?>
-<ds:datastoreItem xmlns:ds="http://schemas.openxmlformats.org/officeDocument/2006/customXml" ds:itemID="{3F2AE3CF-AF0A-42C7-BC75-AAA91D189F19}">
-  <ds:schemaRefs>
-    <ds:schemaRef ds:uri="http://schemas.microsoft.com/office/2006/metadata/properties"/>
-    <ds:schemaRef ds:uri="http://schemas.microsoft.com/office/infopath/2007/PartnerControls"/>
-    <ds:schemaRef ds:uri="d71ff2ac-62c7-44d6-abd7-1383af8796a8"/>
-  </ds:schemaRefs>
-</ds:datastoreItem>
-</file>
-
 <file path=customXml/itemProps4.xml><?xml version="1.0" encoding="utf-8"?>
 <ds:datastoreItem xmlns:ds="http://schemas.openxmlformats.org/officeDocument/2006/customXml" ds:itemID="{500AA85C-6BEF-45D1-AD66-44E6B9A5378D}">
   <ds:schemaRefs>

</xml_diff>

<commit_message>
Report, sections added to overview
</commit_message>
<xml_diff>
--- a/Report/SiteSafeReport.docx
+++ b/Report/SiteSafeReport.docx
@@ -556,7 +556,7 @@
           <w:szCs w:val="32"/>
         </w:rPr>
         <w:drawing>
-          <wp:anchor distT="0" distB="0" distL="114300" distR="114300" simplePos="0" relativeHeight="251540480" behindDoc="0" locked="0" layoutInCell="1" allowOverlap="1" wp14:anchorId="1AE65912" wp14:editId="236A2EF4">
+          <wp:anchor distT="0" distB="0" distL="114300" distR="114300" simplePos="0" relativeHeight="251540480" behindDoc="0" locked="0" layoutInCell="1" allowOverlap="1" wp14:anchorId="1AE65912" wp14:editId="59866C51">
             <wp:simplePos x="0" y="0"/>
             <wp:positionH relativeFrom="column">
               <wp:posOffset>60960</wp:posOffset>
@@ -833,14 +833,7 @@
                                 <w:sz w:val="18"/>
                                 <w:szCs w:val="18"/>
                               </w:rPr>
-                              <w:t xml:space="preserve"> </w:t>
-                            </w:r>
-                            <w:r>
-                              <w:rPr>
-                                <w:sz w:val="18"/>
-                                <w:szCs w:val="18"/>
-                              </w:rPr>
-                              <w:t>SiteSafe Logo</w:t>
+                              <w:t xml:space="preserve"> SiteSafe Logo</w:t>
                             </w:r>
                           </w:p>
                         </w:txbxContent>
@@ -905,14 +898,7 @@
                           <w:sz w:val="18"/>
                           <w:szCs w:val="18"/>
                         </w:rPr>
-                        <w:t xml:space="preserve"> </w:t>
-                      </w:r>
-                      <w:r>
-                        <w:rPr>
-                          <w:sz w:val="18"/>
-                          <w:szCs w:val="18"/>
-                        </w:rPr>
-                        <w:t>SiteSafe Logo</w:t>
+                        <w:t xml:space="preserve"> SiteSafe Logo</w:t>
                       </w:r>
                     </w:p>
                   </w:txbxContent>
@@ -1915,7 +1901,7 @@
           <w:lang w:val="en-GB"/>
         </w:rPr>
         <w:drawing>
-          <wp:inline distT="0" distB="0" distL="0" distR="0" wp14:anchorId="53A945EF" wp14:editId="0DD65AE1">
+          <wp:inline distT="0" distB="0" distL="0" distR="0" wp14:anchorId="53A945EF" wp14:editId="481E9D54">
             <wp:extent cx="5731510" cy="2737485"/>
             <wp:effectExtent l="0" t="0" r="2540" b="5715"/>
             <wp:docPr id="1129281438" name="Picture 6" descr="A registration form with red and blue text&#10;&#10;AI-generated content may be incorrect."/>
@@ -2022,19 +2008,7 @@
         <w:rPr>
           <w:lang w:val="en-GB"/>
         </w:rPr>
-        <w:t xml:space="preserve"> costly training for the company. All buttons are intuitive and clearly </w:t>
-      </w:r>
-      <w:r>
-        <w:rPr>
-          <w:lang w:val="en-GB"/>
-        </w:rPr>
-        <w:t>labelled</w:t>
-      </w:r>
-      <w:r>
-        <w:rPr>
-          <w:lang w:val="en-GB"/>
-        </w:rPr>
-        <w:t>, giving the user a clear understanding of their function.</w:t>
+        <w:t xml:space="preserve"> costly training for the company. All buttons are intuitive and clearly labelled, giving the user a clear understanding of their function.</w:t>
       </w:r>
     </w:p>
     <w:p>
@@ -2141,7 +2115,19 @@
         <w:rPr>
           <w:lang w:val="en-GB"/>
         </w:rPr>
-        <w:t>The Description menu option brings the user to a simple description of the application and the technologies used to make the application work.</w:t>
+        <w:t>The Description menu option brings the user to a simple</w:t>
+      </w:r>
+      <w:r>
+        <w:rPr>
+          <w:lang w:val="en-GB"/>
+        </w:rPr>
+        <w:t xml:space="preserve"> overview of the</w:t>
+      </w:r>
+      <w:r>
+        <w:rPr>
+          <w:lang w:val="en-GB"/>
+        </w:rPr>
+        <w:t xml:space="preserve"> description of the application and the technologies used to make the application work.</w:t>
       </w:r>
     </w:p>
     <w:p>
@@ -2156,7 +2142,7 @@
           <w:lang w:val="en-GB"/>
         </w:rPr>
         <w:drawing>
-          <wp:inline distT="0" distB="0" distL="0" distR="0" wp14:anchorId="4E677B2D" wp14:editId="0C975852">
+          <wp:inline distT="0" distB="0" distL="0" distR="0" wp14:anchorId="4E677B2D" wp14:editId="61F9D2F3">
             <wp:extent cx="5731510" cy="2597785"/>
             <wp:effectExtent l="0" t="0" r="2540" b="0"/>
             <wp:docPr id="945243528" name="Picture 8" descr="A screenshot of a computer&#10;&#10;AI-generated content may be incorrect."/>
@@ -2204,97 +2190,1024 @@
           <w:lang w:val="en-GB"/>
         </w:rPr>
       </w:pPr>
-    </w:p>
-    <w:p>
-      <w:pPr>
-        <w:rPr>
-          <w:lang w:val="en-GB"/>
-        </w:rPr>
-      </w:pPr>
-    </w:p>
-    <w:p>
-      <w:pPr>
-        <w:rPr>
-          <w:lang w:val="en-GB"/>
-        </w:rPr>
-      </w:pPr>
-    </w:p>
-    <w:p>
-      <w:pPr>
-        <w:rPr>
-          <w:lang w:val="en-GB"/>
-        </w:rPr>
-      </w:pPr>
-    </w:p>
-    <w:p>
-      <w:pPr>
-        <w:rPr>
-          <w:lang w:val="en-GB"/>
-        </w:rPr>
-      </w:pPr>
-    </w:p>
-    <w:p>
-      <w:pPr>
-        <w:rPr>
-          <w:lang w:val="en-GB"/>
-        </w:rPr>
-      </w:pPr>
-    </w:p>
-    <w:p>
-      <w:pPr>
-        <w:rPr>
-          <w:lang w:val="en-GB"/>
-        </w:rPr>
-      </w:pPr>
-    </w:p>
-    <w:p>
-      <w:pPr>
-        <w:rPr>
-          <w:lang w:val="en-GB"/>
-        </w:rPr>
-      </w:pPr>
-    </w:p>
-    <w:p>
-      <w:pPr>
-        <w:rPr>
-          <w:lang w:val="en-GB"/>
-        </w:rPr>
-      </w:pPr>
-    </w:p>
-    <w:p>
-      <w:pPr>
-        <w:rPr>
-          <w:lang w:val="en-GB"/>
-        </w:rPr>
-      </w:pPr>
-    </w:p>
-    <w:p>
-      <w:pPr>
-        <w:rPr>
-          <w:lang w:val="en-GB"/>
-        </w:rPr>
-      </w:pPr>
-    </w:p>
-    <w:p>
-      <w:pPr>
-        <w:rPr>
-          <w:lang w:val="en-GB"/>
-        </w:rPr>
-      </w:pPr>
-    </w:p>
-    <w:p>
-      <w:pPr>
-        <w:rPr>
-          <w:lang w:val="en-GB"/>
-        </w:rPr>
-      </w:pPr>
-    </w:p>
-    <w:p>
-      <w:pPr>
-        <w:rPr>
-          <w:lang w:val="en-GB"/>
-        </w:rPr>
-      </w:pPr>
+      <w:r>
+        <w:rPr>
+          <w:lang w:val="en-GB"/>
+        </w:rPr>
+        <w:lastRenderedPageBreak/>
+        <w:t>The documentation section is used to give the users access to the pdf documents for the Specifications, Poster, Design and Report documents.</w:t>
+      </w:r>
+    </w:p>
+    <w:p>
+      <w:pPr>
+        <w:rPr>
+          <w:lang w:val="en-GB"/>
+        </w:rPr>
+      </w:pPr>
+      <w:r>
+        <w:rPr>
+          <w:noProof/>
+          <w:lang w:val="en-GB"/>
+        </w:rPr>
+        <w:drawing>
+          <wp:inline distT="0" distB="0" distL="0" distR="0" wp14:anchorId="5DB46E21" wp14:editId="5491370D">
+            <wp:extent cx="5731510" cy="1578610"/>
+            <wp:effectExtent l="0" t="0" r="2540" b="2540"/>
+            <wp:docPr id="517492343" name="Picture 5" descr="A screenshot of a computer&#10;&#10;AI-generated content may be incorrect."/>
+            <wp:cNvGraphicFramePr>
+              <a:graphicFrameLocks xmlns:a="http://schemas.openxmlformats.org/drawingml/2006/main" noChangeAspect="1"/>
+            </wp:cNvGraphicFramePr>
+            <a:graphic xmlns:a="http://schemas.openxmlformats.org/drawingml/2006/main">
+              <a:graphicData uri="http://schemas.openxmlformats.org/drawingml/2006/picture">
+                <pic:pic xmlns:pic="http://schemas.openxmlformats.org/drawingml/2006/picture">
+                  <pic:nvPicPr>
+                    <pic:cNvPr id="517492343" name="Picture 5" descr="A screenshot of a computer&#10;&#10;AI-generated content may be incorrect."/>
+                    <pic:cNvPicPr/>
+                  </pic:nvPicPr>
+                  <pic:blipFill>
+                    <a:blip r:embed="rId18" cstate="print">
+                      <a:extLst>
+                        <a:ext uri="{28A0092B-C50C-407E-A947-70E740481C1C}">
+                          <a14:useLocalDpi xmlns:a14="http://schemas.microsoft.com/office/drawing/2010/main" val="0"/>
+                        </a:ext>
+                      </a:extLst>
+                    </a:blip>
+                    <a:stretch>
+                      <a:fillRect/>
+                    </a:stretch>
+                  </pic:blipFill>
+                  <pic:spPr>
+                    <a:xfrm>
+                      <a:off x="0" y="0"/>
+                      <a:ext cx="5731510" cy="1578610"/>
+                    </a:xfrm>
+                    <a:prstGeom prst="rect">
+                      <a:avLst/>
+                    </a:prstGeom>
+                  </pic:spPr>
+                </pic:pic>
+              </a:graphicData>
+            </a:graphic>
+          </wp:inline>
+        </w:drawing>
+      </w:r>
+    </w:p>
+    <w:p>
+      <w:pPr>
+        <w:rPr>
+          <w:lang w:val="en-GB"/>
+        </w:rPr>
+      </w:pPr>
+    </w:p>
+    <w:p>
+      <w:pPr>
+        <w:rPr>
+          <w:lang w:val="en-GB"/>
+        </w:rPr>
+      </w:pPr>
+      <w:r>
+        <w:rPr>
+          <w:lang w:val="en-GB"/>
+        </w:rPr>
+        <w:t xml:space="preserve">The contact section is used to be able to contact the creator for any support associated with the application. There are multiple ways to make contact like email, phone, </w:t>
+      </w:r>
+      <w:proofErr w:type="spellStart"/>
+      <w:r>
+        <w:rPr>
+          <w:lang w:val="en-GB"/>
+        </w:rPr>
+        <w:t>github</w:t>
+      </w:r>
+      <w:proofErr w:type="spellEnd"/>
+      <w:r>
+        <w:rPr>
+          <w:lang w:val="en-GB"/>
+        </w:rPr>
+        <w:t xml:space="preserve"> and </w:t>
+      </w:r>
+      <w:proofErr w:type="spellStart"/>
+      <w:r>
+        <w:rPr>
+          <w:lang w:val="en-GB"/>
+        </w:rPr>
+        <w:t>linkedIn</w:t>
+      </w:r>
+      <w:proofErr w:type="spellEnd"/>
+      <w:r>
+        <w:rPr>
+          <w:lang w:val="en-GB"/>
+        </w:rPr>
+        <w:t>. The users may contact the creator for any queries or questions.</w:t>
+      </w:r>
+    </w:p>
+    <w:p>
+      <w:pPr>
+        <w:rPr>
+          <w:lang w:val="en-GB"/>
+        </w:rPr>
+      </w:pPr>
+      <w:r>
+        <w:rPr>
+          <w:noProof/>
+          <w:lang w:val="en-GB"/>
+        </w:rPr>
+        <w:drawing>
+          <wp:inline distT="0" distB="0" distL="0" distR="0" wp14:anchorId="4194B509" wp14:editId="185D7654">
+            <wp:extent cx="5731510" cy="1369060"/>
+            <wp:effectExtent l="0" t="0" r="2540" b="2540"/>
+            <wp:docPr id="144874586" name="Picture 6" descr="A screenshot of a computer&#10;&#10;AI-generated content may be incorrect."/>
+            <wp:cNvGraphicFramePr>
+              <a:graphicFrameLocks xmlns:a="http://schemas.openxmlformats.org/drawingml/2006/main" noChangeAspect="1"/>
+            </wp:cNvGraphicFramePr>
+            <a:graphic xmlns:a="http://schemas.openxmlformats.org/drawingml/2006/main">
+              <a:graphicData uri="http://schemas.openxmlformats.org/drawingml/2006/picture">
+                <pic:pic xmlns:pic="http://schemas.openxmlformats.org/drawingml/2006/picture">
+                  <pic:nvPicPr>
+                    <pic:cNvPr id="144874586" name="Picture 6" descr="A screenshot of a computer&#10;&#10;AI-generated content may be incorrect."/>
+                    <pic:cNvPicPr/>
+                  </pic:nvPicPr>
+                  <pic:blipFill>
+                    <a:blip r:embed="rId19" cstate="print">
+                      <a:extLst>
+                        <a:ext uri="{28A0092B-C50C-407E-A947-70E740481C1C}">
+                          <a14:useLocalDpi xmlns:a14="http://schemas.microsoft.com/office/drawing/2010/main" val="0"/>
+                        </a:ext>
+                      </a:extLst>
+                    </a:blip>
+                    <a:stretch>
+                      <a:fillRect/>
+                    </a:stretch>
+                  </pic:blipFill>
+                  <pic:spPr>
+                    <a:xfrm>
+                      <a:off x="0" y="0"/>
+                      <a:ext cx="5731510" cy="1369060"/>
+                    </a:xfrm>
+                    <a:prstGeom prst="rect">
+                      <a:avLst/>
+                    </a:prstGeom>
+                  </pic:spPr>
+                </pic:pic>
+              </a:graphicData>
+            </a:graphic>
+          </wp:inline>
+        </w:drawing>
+      </w:r>
+    </w:p>
+    <w:p>
+      <w:pPr>
+        <w:rPr>
+          <w:lang w:val="en-GB"/>
+        </w:rPr>
+      </w:pPr>
+    </w:p>
+    <w:p>
+      <w:pPr>
+        <w:rPr>
+          <w:lang w:val="en-GB"/>
+        </w:rPr>
+      </w:pPr>
+      <w:r>
+        <w:rPr>
+          <w:lang w:val="en-GB"/>
+        </w:rPr>
+        <w:t>The next major section of the application is the Users section</w:t>
+      </w:r>
+      <w:r>
+        <w:rPr>
+          <w:lang w:val="en-GB"/>
+        </w:rPr>
+        <w:t xml:space="preserve">. This section is only available to the admin user. The normal user does not have access to this page. </w:t>
+      </w:r>
+    </w:p>
+    <w:p>
+      <w:pPr>
+        <w:rPr>
+          <w:lang w:val="en-GB"/>
+        </w:rPr>
+      </w:pPr>
+      <w:r>
+        <w:rPr>
+          <w:lang w:val="en-GB"/>
+        </w:rPr>
+        <w:t xml:space="preserve">When entering the User page, the page displays a table of all the users for the company that the admin is </w:t>
+      </w:r>
+      <w:proofErr w:type="spellStart"/>
+      <w:r>
+        <w:rPr>
+          <w:lang w:val="en-GB"/>
+        </w:rPr>
+        <w:t>loged</w:t>
+      </w:r>
+      <w:proofErr w:type="spellEnd"/>
+      <w:r>
+        <w:rPr>
+          <w:lang w:val="en-GB"/>
+        </w:rPr>
+        <w:t xml:space="preserve"> in for, including their own account. This is where the admin </w:t>
+      </w:r>
+      <w:proofErr w:type="gramStart"/>
+      <w:r>
+        <w:rPr>
+          <w:lang w:val="en-GB"/>
+        </w:rPr>
+        <w:t>is able to</w:t>
+      </w:r>
+      <w:proofErr w:type="gramEnd"/>
+      <w:r>
+        <w:rPr>
+          <w:lang w:val="en-GB"/>
+        </w:rPr>
+        <w:t xml:space="preserve"> adjust all the users for that company. They </w:t>
+      </w:r>
+      <w:proofErr w:type="gramStart"/>
+      <w:r>
+        <w:rPr>
+          <w:lang w:val="en-GB"/>
+        </w:rPr>
+        <w:t>are able to</w:t>
+      </w:r>
+      <w:proofErr w:type="gramEnd"/>
+      <w:r>
+        <w:rPr>
+          <w:lang w:val="en-GB"/>
+        </w:rPr>
+        <w:t xml:space="preserve"> review any details for any user including other admin users. On each row at the </w:t>
+      </w:r>
+      <w:proofErr w:type="gramStart"/>
+      <w:r>
+        <w:rPr>
+          <w:lang w:val="en-GB"/>
+        </w:rPr>
+        <w:t>right hand</w:t>
+      </w:r>
+      <w:proofErr w:type="gramEnd"/>
+      <w:r>
+        <w:rPr>
+          <w:lang w:val="en-GB"/>
+        </w:rPr>
+        <w:t xml:space="preserve"> side there is two buttons. The edit button that lets the user edit user details and the delete button which deleted the user that the row is on.</w:t>
+      </w:r>
+    </w:p>
+    <w:p>
+      <w:pPr>
+        <w:rPr>
+          <w:lang w:val="en-GB"/>
+        </w:rPr>
+      </w:pPr>
+      <w:r>
+        <w:rPr>
+          <w:lang w:val="en-GB"/>
+        </w:rPr>
+        <w:t>There are two buttons at the top of the page. The first on the left is used to go back to the main page. The second button on the right is used to add a new user which may be a normal user or an admin user.</w:t>
+      </w:r>
+    </w:p>
+    <w:p>
+      <w:pPr>
+        <w:rPr>
+          <w:lang w:val="en-GB"/>
+        </w:rPr>
+      </w:pPr>
+    </w:p>
+    <w:p>
+      <w:pPr>
+        <w:rPr>
+          <w:lang w:val="en-GB"/>
+        </w:rPr>
+      </w:pPr>
+      <w:r>
+        <w:rPr>
+          <w:noProof/>
+          <w:lang w:val="en-GB"/>
+        </w:rPr>
+        <w:lastRenderedPageBreak/>
+        <w:drawing>
+          <wp:inline distT="0" distB="0" distL="0" distR="0" wp14:anchorId="7B8810E3" wp14:editId="5702900F">
+            <wp:extent cx="5731510" cy="1880235"/>
+            <wp:effectExtent l="0" t="0" r="2540" b="5715"/>
+            <wp:docPr id="1217441291" name="Picture 7" descr="A screenshot of a user list&#10;&#10;AI-generated content may be incorrect."/>
+            <wp:cNvGraphicFramePr>
+              <a:graphicFrameLocks xmlns:a="http://schemas.openxmlformats.org/drawingml/2006/main" noChangeAspect="1"/>
+            </wp:cNvGraphicFramePr>
+            <a:graphic xmlns:a="http://schemas.openxmlformats.org/drawingml/2006/main">
+              <a:graphicData uri="http://schemas.openxmlformats.org/drawingml/2006/picture">
+                <pic:pic xmlns:pic="http://schemas.openxmlformats.org/drawingml/2006/picture">
+                  <pic:nvPicPr>
+                    <pic:cNvPr id="1217441291" name="Picture 7" descr="A screenshot of a user list&#10;&#10;AI-generated content may be incorrect."/>
+                    <pic:cNvPicPr/>
+                  </pic:nvPicPr>
+                  <pic:blipFill>
+                    <a:blip r:embed="rId20" cstate="print">
+                      <a:extLst>
+                        <a:ext uri="{28A0092B-C50C-407E-A947-70E740481C1C}">
+                          <a14:useLocalDpi xmlns:a14="http://schemas.microsoft.com/office/drawing/2010/main" val="0"/>
+                        </a:ext>
+                      </a:extLst>
+                    </a:blip>
+                    <a:stretch>
+                      <a:fillRect/>
+                    </a:stretch>
+                  </pic:blipFill>
+                  <pic:spPr>
+                    <a:xfrm>
+                      <a:off x="0" y="0"/>
+                      <a:ext cx="5731510" cy="1880235"/>
+                    </a:xfrm>
+                    <a:prstGeom prst="rect">
+                      <a:avLst/>
+                    </a:prstGeom>
+                  </pic:spPr>
+                </pic:pic>
+              </a:graphicData>
+            </a:graphic>
+          </wp:inline>
+        </w:drawing>
+      </w:r>
+    </w:p>
+    <w:p>
+      <w:pPr>
+        <w:rPr>
+          <w:lang w:val="en-GB"/>
+        </w:rPr>
+      </w:pPr>
+      <w:r>
+        <w:rPr>
+          <w:lang w:val="en-GB"/>
+        </w:rPr>
+        <w:t xml:space="preserve">Once the edit button is clicked on the user row. A </w:t>
+      </w:r>
+      <w:proofErr w:type="gramStart"/>
+      <w:r>
+        <w:rPr>
+          <w:lang w:val="en-GB"/>
+        </w:rPr>
+        <w:t>user friendly</w:t>
+      </w:r>
+      <w:proofErr w:type="gramEnd"/>
+      <w:r>
+        <w:rPr>
+          <w:lang w:val="en-GB"/>
+        </w:rPr>
+        <w:t xml:space="preserve"> model pops up, if the cancel is clicked or clicked outside this model it will close the edit user going back to the user list, not saving any changes.</w:t>
+      </w:r>
+    </w:p>
+    <w:p>
+      <w:pPr>
+        <w:rPr>
+          <w:lang w:val="en-GB"/>
+        </w:rPr>
+      </w:pPr>
+      <w:r>
+        <w:rPr>
+          <w:lang w:val="en-GB"/>
+        </w:rPr>
+        <w:t>The admin may change the First Name, Last Name, Email and the status of access. Only when the save button is clicked that the details are then saved to the database. When the save button is clicked the user is also brought back to the user list page.</w:t>
+      </w:r>
+    </w:p>
+    <w:p>
+      <w:pPr>
+        <w:rPr>
+          <w:lang w:val="en-GB"/>
+        </w:rPr>
+      </w:pPr>
+      <w:r>
+        <w:rPr>
+          <w:noProof/>
+          <w:lang w:val="en-GB"/>
+        </w:rPr>
+        <w:drawing>
+          <wp:inline distT="0" distB="0" distL="0" distR="0" wp14:anchorId="084D132E" wp14:editId="5C487350">
+            <wp:extent cx="5731510" cy="2586355"/>
+            <wp:effectExtent l="0" t="0" r="2540" b="4445"/>
+            <wp:docPr id="1450264916" name="Picture 8" descr="A screenshot of a computer&#10;&#10;AI-generated content may be incorrect."/>
+            <wp:cNvGraphicFramePr>
+              <a:graphicFrameLocks xmlns:a="http://schemas.openxmlformats.org/drawingml/2006/main" noChangeAspect="1"/>
+            </wp:cNvGraphicFramePr>
+            <a:graphic xmlns:a="http://schemas.openxmlformats.org/drawingml/2006/main">
+              <a:graphicData uri="http://schemas.openxmlformats.org/drawingml/2006/picture">
+                <pic:pic xmlns:pic="http://schemas.openxmlformats.org/drawingml/2006/picture">
+                  <pic:nvPicPr>
+                    <pic:cNvPr id="1450264916" name="Picture 8" descr="A screenshot of a computer&#10;&#10;AI-generated content may be incorrect."/>
+                    <pic:cNvPicPr/>
+                  </pic:nvPicPr>
+                  <pic:blipFill>
+                    <a:blip r:embed="rId21" cstate="print">
+                      <a:extLst>
+                        <a:ext uri="{28A0092B-C50C-407E-A947-70E740481C1C}">
+                          <a14:useLocalDpi xmlns:a14="http://schemas.microsoft.com/office/drawing/2010/main" val="0"/>
+                        </a:ext>
+                      </a:extLst>
+                    </a:blip>
+                    <a:stretch>
+                      <a:fillRect/>
+                    </a:stretch>
+                  </pic:blipFill>
+                  <pic:spPr>
+                    <a:xfrm>
+                      <a:off x="0" y="0"/>
+                      <a:ext cx="5731510" cy="2586355"/>
+                    </a:xfrm>
+                    <a:prstGeom prst="rect">
+                      <a:avLst/>
+                    </a:prstGeom>
+                  </pic:spPr>
+                </pic:pic>
+              </a:graphicData>
+            </a:graphic>
+          </wp:inline>
+        </w:drawing>
+      </w:r>
+    </w:p>
+    <w:p>
+      <w:pPr>
+        <w:rPr>
+          <w:lang w:val="en-GB"/>
+        </w:rPr>
+      </w:pPr>
+    </w:p>
+    <w:p>
+      <w:pPr>
+        <w:rPr>
+          <w:lang w:val="en-GB"/>
+        </w:rPr>
+      </w:pPr>
+      <w:r>
+        <w:rPr>
+          <w:lang w:val="en-GB"/>
+        </w:rPr>
+        <w:t>When the Add User button is clicked the user is brought to the Add User page. Once all the required details are entered a new user is added to the database for that company. The page also gives the user two options for returning to the main screen or the user list.</w:t>
+      </w:r>
+    </w:p>
+    <w:p>
+      <w:pPr>
+        <w:rPr>
+          <w:lang w:val="en-GB"/>
+        </w:rPr>
+      </w:pPr>
+    </w:p>
+    <w:p>
+      <w:pPr>
+        <w:rPr>
+          <w:lang w:val="en-GB"/>
+        </w:rPr>
+      </w:pPr>
+      <w:r>
+        <w:rPr>
+          <w:noProof/>
+          <w:lang w:val="en-GB"/>
+        </w:rPr>
+        <w:lastRenderedPageBreak/>
+        <w:drawing>
+          <wp:inline distT="0" distB="0" distL="0" distR="0" wp14:anchorId="0684A97B" wp14:editId="35B18B5E">
+            <wp:extent cx="5731510" cy="2590800"/>
+            <wp:effectExtent l="0" t="0" r="2540" b="0"/>
+            <wp:docPr id="1210981076" name="Picture 9" descr="A white paper with blue text and red text&#10;&#10;AI-generated content may be incorrect."/>
+            <wp:cNvGraphicFramePr>
+              <a:graphicFrameLocks xmlns:a="http://schemas.openxmlformats.org/drawingml/2006/main" noChangeAspect="1"/>
+            </wp:cNvGraphicFramePr>
+            <a:graphic xmlns:a="http://schemas.openxmlformats.org/drawingml/2006/main">
+              <a:graphicData uri="http://schemas.openxmlformats.org/drawingml/2006/picture">
+                <pic:pic xmlns:pic="http://schemas.openxmlformats.org/drawingml/2006/picture">
+                  <pic:nvPicPr>
+                    <pic:cNvPr id="1210981076" name="Picture 9" descr="A white paper with blue text and red text&#10;&#10;AI-generated content may be incorrect."/>
+                    <pic:cNvPicPr/>
+                  </pic:nvPicPr>
+                  <pic:blipFill>
+                    <a:blip r:embed="rId22" cstate="print">
+                      <a:extLst>
+                        <a:ext uri="{28A0092B-C50C-407E-A947-70E740481C1C}">
+                          <a14:useLocalDpi xmlns:a14="http://schemas.microsoft.com/office/drawing/2010/main" val="0"/>
+                        </a:ext>
+                      </a:extLst>
+                    </a:blip>
+                    <a:stretch>
+                      <a:fillRect/>
+                    </a:stretch>
+                  </pic:blipFill>
+                  <pic:spPr>
+                    <a:xfrm>
+                      <a:off x="0" y="0"/>
+                      <a:ext cx="5731510" cy="2590800"/>
+                    </a:xfrm>
+                    <a:prstGeom prst="rect">
+                      <a:avLst/>
+                    </a:prstGeom>
+                  </pic:spPr>
+                </pic:pic>
+              </a:graphicData>
+            </a:graphic>
+          </wp:inline>
+        </w:drawing>
+      </w:r>
+    </w:p>
+    <w:p>
+      <w:pPr>
+        <w:rPr>
+          <w:lang w:val="en-GB"/>
+        </w:rPr>
+      </w:pPr>
+    </w:p>
+    <w:p>
+      <w:pPr>
+        <w:rPr>
+          <w:lang w:val="en-GB"/>
+        </w:rPr>
+      </w:pPr>
+      <w:r>
+        <w:rPr>
+          <w:lang w:val="en-GB"/>
+        </w:rPr>
+        <w:t xml:space="preserve">The next major section is the Camera section. In this admin user </w:t>
+      </w:r>
+      <w:proofErr w:type="gramStart"/>
+      <w:r>
+        <w:rPr>
+          <w:lang w:val="en-GB"/>
+        </w:rPr>
+        <w:t>is able to</w:t>
+      </w:r>
+      <w:proofErr w:type="gramEnd"/>
+      <w:r>
+        <w:rPr>
+          <w:lang w:val="en-GB"/>
+        </w:rPr>
+        <w:t xml:space="preserve"> create, review, update and delete cameras. The cameras are then brought up as a list when connecting to the camera, where the user </w:t>
+      </w:r>
+      <w:proofErr w:type="gramStart"/>
+      <w:r>
+        <w:rPr>
+          <w:lang w:val="en-GB"/>
+        </w:rPr>
+        <w:t>is able to</w:t>
+      </w:r>
+      <w:proofErr w:type="gramEnd"/>
+      <w:r>
+        <w:rPr>
+          <w:lang w:val="en-GB"/>
+        </w:rPr>
+        <w:t xml:space="preserve"> connect the camera chosen from this table.</w:t>
+      </w:r>
+    </w:p>
+    <w:p>
+      <w:pPr>
+        <w:rPr>
+          <w:lang w:val="en-GB"/>
+        </w:rPr>
+      </w:pPr>
+      <w:proofErr w:type="gramStart"/>
+      <w:r>
+        <w:rPr>
+          <w:lang w:val="en-GB"/>
+        </w:rPr>
+        <w:t>Similar to</w:t>
+      </w:r>
+      <w:proofErr w:type="gramEnd"/>
+      <w:r>
+        <w:rPr>
+          <w:lang w:val="en-GB"/>
+        </w:rPr>
+        <w:t xml:space="preserve"> the user screen, the options at the top are to </w:t>
+      </w:r>
+      <w:proofErr w:type="gramStart"/>
+      <w:r>
+        <w:rPr>
+          <w:lang w:val="en-GB"/>
+        </w:rPr>
+        <w:t>go  back</w:t>
+      </w:r>
+      <w:proofErr w:type="gramEnd"/>
+      <w:r>
+        <w:rPr>
+          <w:lang w:val="en-GB"/>
+        </w:rPr>
+        <w:t xml:space="preserve"> to the main page of the left button and to add a new camera on the right button. Also, the edit and delete buttons are on the rows of the camera. These buttons correspond with the camera row.</w:t>
+      </w:r>
+    </w:p>
+    <w:p>
+      <w:pPr>
+        <w:rPr>
+          <w:lang w:val="en-GB"/>
+        </w:rPr>
+      </w:pPr>
+      <w:r>
+        <w:rPr>
+          <w:noProof/>
+          <w:lang w:val="en-GB"/>
+        </w:rPr>
+        <w:drawing>
+          <wp:inline distT="0" distB="0" distL="0" distR="0" wp14:anchorId="2FF49B6E" wp14:editId="6B9B08E8">
+            <wp:extent cx="5731510" cy="1545590"/>
+            <wp:effectExtent l="0" t="0" r="2540" b="0"/>
+            <wp:docPr id="2087845771" name="Picture 10" descr="A screenshot of a computer&#10;&#10;AI-generated content may be incorrect."/>
+            <wp:cNvGraphicFramePr>
+              <a:graphicFrameLocks xmlns:a="http://schemas.openxmlformats.org/drawingml/2006/main" noChangeAspect="1"/>
+            </wp:cNvGraphicFramePr>
+            <a:graphic xmlns:a="http://schemas.openxmlformats.org/drawingml/2006/main">
+              <a:graphicData uri="http://schemas.openxmlformats.org/drawingml/2006/picture">
+                <pic:pic xmlns:pic="http://schemas.openxmlformats.org/drawingml/2006/picture">
+                  <pic:nvPicPr>
+                    <pic:cNvPr id="2087845771" name="Picture 10" descr="A screenshot of a computer&#10;&#10;AI-generated content may be incorrect."/>
+                    <pic:cNvPicPr/>
+                  </pic:nvPicPr>
+                  <pic:blipFill>
+                    <a:blip r:embed="rId23" cstate="print">
+                      <a:extLst>
+                        <a:ext uri="{28A0092B-C50C-407E-A947-70E740481C1C}">
+                          <a14:useLocalDpi xmlns:a14="http://schemas.microsoft.com/office/drawing/2010/main" val="0"/>
+                        </a:ext>
+                      </a:extLst>
+                    </a:blip>
+                    <a:stretch>
+                      <a:fillRect/>
+                    </a:stretch>
+                  </pic:blipFill>
+                  <pic:spPr>
+                    <a:xfrm>
+                      <a:off x="0" y="0"/>
+                      <a:ext cx="5731510" cy="1545590"/>
+                    </a:xfrm>
+                    <a:prstGeom prst="rect">
+                      <a:avLst/>
+                    </a:prstGeom>
+                  </pic:spPr>
+                </pic:pic>
+              </a:graphicData>
+            </a:graphic>
+          </wp:inline>
+        </w:drawing>
+      </w:r>
+    </w:p>
+    <w:p>
+      <w:pPr>
+        <w:rPr>
+          <w:lang w:val="en-GB"/>
+        </w:rPr>
+      </w:pPr>
+    </w:p>
+    <w:p>
+      <w:pPr>
+        <w:rPr>
+          <w:lang w:val="en-GB"/>
+        </w:rPr>
+      </w:pPr>
+      <w:r>
+        <w:rPr>
+          <w:lang w:val="en-GB"/>
+        </w:rPr>
+        <w:t xml:space="preserve">The edit button allows the user to edit the following fields. Camera name and location that the camera is placed. </w:t>
+      </w:r>
+    </w:p>
+    <w:p>
+      <w:pPr>
+        <w:rPr>
+          <w:lang w:val="en-GB"/>
+        </w:rPr>
+      </w:pPr>
+      <w:r>
+        <w:rPr>
+          <w:noProof/>
+          <w:lang w:val="en-GB"/>
+        </w:rPr>
+        <w:lastRenderedPageBreak/>
+        <w:drawing>
+          <wp:inline distT="0" distB="0" distL="0" distR="0" wp14:anchorId="48AA710E" wp14:editId="4DF92F5E">
+            <wp:extent cx="5731510" cy="2587625"/>
+            <wp:effectExtent l="0" t="0" r="2540" b="3175"/>
+            <wp:docPr id="1097623260" name="Picture 11" descr="A screen shot of a camera list&#10;&#10;AI-generated content may be incorrect."/>
+            <wp:cNvGraphicFramePr>
+              <a:graphicFrameLocks xmlns:a="http://schemas.openxmlformats.org/drawingml/2006/main" noChangeAspect="1"/>
+            </wp:cNvGraphicFramePr>
+            <a:graphic xmlns:a="http://schemas.openxmlformats.org/drawingml/2006/main">
+              <a:graphicData uri="http://schemas.openxmlformats.org/drawingml/2006/picture">
+                <pic:pic xmlns:pic="http://schemas.openxmlformats.org/drawingml/2006/picture">
+                  <pic:nvPicPr>
+                    <pic:cNvPr id="1097623260" name="Picture 11" descr="A screen shot of a camera list&#10;&#10;AI-generated content may be incorrect."/>
+                    <pic:cNvPicPr/>
+                  </pic:nvPicPr>
+                  <pic:blipFill>
+                    <a:blip r:embed="rId24" cstate="print">
+                      <a:extLst>
+                        <a:ext uri="{28A0092B-C50C-407E-A947-70E740481C1C}">
+                          <a14:useLocalDpi xmlns:a14="http://schemas.microsoft.com/office/drawing/2010/main" val="0"/>
+                        </a:ext>
+                      </a:extLst>
+                    </a:blip>
+                    <a:stretch>
+                      <a:fillRect/>
+                    </a:stretch>
+                  </pic:blipFill>
+                  <pic:spPr>
+                    <a:xfrm>
+                      <a:off x="0" y="0"/>
+                      <a:ext cx="5731510" cy="2587625"/>
+                    </a:xfrm>
+                    <a:prstGeom prst="rect">
+                      <a:avLst/>
+                    </a:prstGeom>
+                  </pic:spPr>
+                </pic:pic>
+              </a:graphicData>
+            </a:graphic>
+          </wp:inline>
+        </w:drawing>
+      </w:r>
+    </w:p>
+    <w:p>
+      <w:pPr>
+        <w:rPr>
+          <w:lang w:val="en-GB"/>
+        </w:rPr>
+      </w:pPr>
+    </w:p>
+    <w:p>
+      <w:pPr>
+        <w:rPr>
+          <w:lang w:val="en-GB"/>
+        </w:rPr>
+      </w:pPr>
+      <w:r>
+        <w:rPr>
+          <w:lang w:val="en-GB"/>
+        </w:rPr>
+        <w:t>The add camera page only required the user to enter in two fields. The camera name and the location.</w:t>
+      </w:r>
+    </w:p>
+    <w:p>
+      <w:pPr>
+        <w:rPr>
+          <w:lang w:val="en-GB"/>
+        </w:rPr>
+      </w:pPr>
+      <w:r>
+        <w:rPr>
+          <w:noProof/>
+          <w:lang w:val="en-GB"/>
+        </w:rPr>
+        <w:drawing>
+          <wp:inline distT="0" distB="0" distL="0" distR="0" wp14:anchorId="4AD3EB72" wp14:editId="789F5B07">
+            <wp:extent cx="5731510" cy="2578735"/>
+            <wp:effectExtent l="0" t="0" r="2540" b="0"/>
+            <wp:docPr id="1110908656" name="Picture 12" descr="A white box with blue text&#10;&#10;AI-generated content may be incorrect."/>
+            <wp:cNvGraphicFramePr>
+              <a:graphicFrameLocks xmlns:a="http://schemas.openxmlformats.org/drawingml/2006/main" noChangeAspect="1"/>
+            </wp:cNvGraphicFramePr>
+            <a:graphic xmlns:a="http://schemas.openxmlformats.org/drawingml/2006/main">
+              <a:graphicData uri="http://schemas.openxmlformats.org/drawingml/2006/picture">
+                <pic:pic xmlns:pic="http://schemas.openxmlformats.org/drawingml/2006/picture">
+                  <pic:nvPicPr>
+                    <pic:cNvPr id="1110908656" name="Picture 12" descr="A white box with blue text&#10;&#10;AI-generated content may be incorrect."/>
+                    <pic:cNvPicPr/>
+                  </pic:nvPicPr>
+                  <pic:blipFill>
+                    <a:blip r:embed="rId25" cstate="print">
+                      <a:extLst>
+                        <a:ext uri="{28A0092B-C50C-407E-A947-70E740481C1C}">
+                          <a14:useLocalDpi xmlns:a14="http://schemas.microsoft.com/office/drawing/2010/main" val="0"/>
+                        </a:ext>
+                      </a:extLst>
+                    </a:blip>
+                    <a:stretch>
+                      <a:fillRect/>
+                    </a:stretch>
+                  </pic:blipFill>
+                  <pic:spPr>
+                    <a:xfrm>
+                      <a:off x="0" y="0"/>
+                      <a:ext cx="5731510" cy="2578735"/>
+                    </a:xfrm>
+                    <a:prstGeom prst="rect">
+                      <a:avLst/>
+                    </a:prstGeom>
+                  </pic:spPr>
+                </pic:pic>
+              </a:graphicData>
+            </a:graphic>
+          </wp:inline>
+        </w:drawing>
+      </w:r>
+    </w:p>
+    <w:p>
+      <w:pPr>
+        <w:rPr>
+          <w:lang w:val="en-GB"/>
+        </w:rPr>
+      </w:pPr>
+    </w:p>
+    <w:p>
+      <w:pPr>
+        <w:rPr>
+          <w:lang w:val="en-GB"/>
+        </w:rPr>
+      </w:pPr>
+      <w:r>
+        <w:rPr>
+          <w:lang w:val="en-GB"/>
+        </w:rPr>
+        <w:t xml:space="preserve">The next major section is the Detection page. This section is a bit different form the user and camera sections. There is no button to add a detection, the detections are added automatically by the system once a no helmet detection had occurred. </w:t>
+      </w:r>
+    </w:p>
+    <w:p>
+      <w:pPr>
+        <w:rPr>
+          <w:lang w:val="en-GB"/>
+        </w:rPr>
+      </w:pPr>
+      <w:r>
+        <w:rPr>
+          <w:lang w:val="en-GB"/>
+        </w:rPr>
+        <w:t xml:space="preserve">Each detection row has some unique features for the detection table. </w:t>
+      </w:r>
+      <w:r>
+        <w:rPr>
+          <w:lang w:val="en-GB"/>
+        </w:rPr>
+        <w:t>We can see that on the very right of the row we still have the delete button for any false detections that may have occurred.</w:t>
+      </w:r>
+      <w:r>
+        <w:rPr>
+          <w:lang w:val="en-GB"/>
+        </w:rPr>
+        <w:t xml:space="preserve"> The image column just before the delete button, once clicked enlarges the image to assist in the reviewing. The review column allows the user to tick or untick the checkbox to display if the detection has been </w:t>
+      </w:r>
+      <w:proofErr w:type="gramStart"/>
+      <w:r>
+        <w:rPr>
+          <w:lang w:val="en-GB"/>
+        </w:rPr>
+        <w:t>review</w:t>
+      </w:r>
+      <w:proofErr w:type="gramEnd"/>
+      <w:r>
+        <w:rPr>
+          <w:lang w:val="en-GB"/>
+        </w:rPr>
+        <w:t xml:space="preserve">. This button can be dynamic based on the company needs. Some companies might have a procedure of checking the image, while other companies might have other actions to be taken before the review button is ticked, for example reviewing the automatic email </w:t>
+      </w:r>
+      <w:proofErr w:type="spellStart"/>
+      <w:r>
+        <w:rPr>
+          <w:lang w:val="en-GB"/>
+        </w:rPr>
+        <w:t>aswell</w:t>
+      </w:r>
+      <w:proofErr w:type="spellEnd"/>
+      <w:r>
+        <w:rPr>
+          <w:lang w:val="en-GB"/>
+        </w:rPr>
+        <w:t>.</w:t>
+      </w:r>
+    </w:p>
+    <w:p>
+      <w:pPr>
+        <w:rPr>
+          <w:lang w:val="en-GB"/>
+        </w:rPr>
+      </w:pPr>
+      <w:r>
+        <w:rPr>
+          <w:noProof/>
+          <w:lang w:val="en-GB"/>
+        </w:rPr>
+        <w:lastRenderedPageBreak/>
+        <w:drawing>
+          <wp:inline distT="0" distB="0" distL="0" distR="0" wp14:anchorId="55C52EFF" wp14:editId="179CE239">
+            <wp:extent cx="5731510" cy="2587625"/>
+            <wp:effectExtent l="0" t="0" r="2540" b="3175"/>
+            <wp:docPr id="2017330561" name="Picture 13" descr="A screenshot of a computer&#10;&#10;AI-generated content may be incorrect."/>
+            <wp:cNvGraphicFramePr>
+              <a:graphicFrameLocks xmlns:a="http://schemas.openxmlformats.org/drawingml/2006/main" noChangeAspect="1"/>
+            </wp:cNvGraphicFramePr>
+            <a:graphic xmlns:a="http://schemas.openxmlformats.org/drawingml/2006/main">
+              <a:graphicData uri="http://schemas.openxmlformats.org/drawingml/2006/picture">
+                <pic:pic xmlns:pic="http://schemas.openxmlformats.org/drawingml/2006/picture">
+                  <pic:nvPicPr>
+                    <pic:cNvPr id="2017330561" name="Picture 13" descr="A screenshot of a computer&#10;&#10;AI-generated content may be incorrect."/>
+                    <pic:cNvPicPr/>
+                  </pic:nvPicPr>
+                  <pic:blipFill>
+                    <a:blip r:embed="rId26" cstate="print">
+                      <a:extLst>
+                        <a:ext uri="{28A0092B-C50C-407E-A947-70E740481C1C}">
+                          <a14:useLocalDpi xmlns:a14="http://schemas.microsoft.com/office/drawing/2010/main" val="0"/>
+                        </a:ext>
+                      </a:extLst>
+                    </a:blip>
+                    <a:stretch>
+                      <a:fillRect/>
+                    </a:stretch>
+                  </pic:blipFill>
+                  <pic:spPr>
+                    <a:xfrm>
+                      <a:off x="0" y="0"/>
+                      <a:ext cx="5731510" cy="2587625"/>
+                    </a:xfrm>
+                    <a:prstGeom prst="rect">
+                      <a:avLst/>
+                    </a:prstGeom>
+                  </pic:spPr>
+                </pic:pic>
+              </a:graphicData>
+            </a:graphic>
+          </wp:inline>
+        </w:drawing>
+      </w:r>
+    </w:p>
+    <w:p>
+      <w:pPr>
+        <w:rPr>
+          <w:lang w:val="en-GB"/>
+        </w:rPr>
+      </w:pPr>
+    </w:p>
+    <w:p>
+      <w:pPr>
+        <w:rPr>
+          <w:lang w:val="en-GB"/>
+        </w:rPr>
+      </w:pPr>
+      <w:r>
+        <w:rPr>
+          <w:lang w:val="en-GB"/>
+        </w:rPr>
+        <w:t xml:space="preserve">The enlarged image view allows the user to see a much clearer and zoomed image of the detection. The reviewer should then be able to identify the </w:t>
+      </w:r>
+      <w:proofErr w:type="gramStart"/>
+      <w:r>
+        <w:rPr>
+          <w:lang w:val="en-GB"/>
+        </w:rPr>
+        <w:t>infraction</w:t>
+      </w:r>
+      <w:proofErr w:type="gramEnd"/>
+      <w:r>
+        <w:rPr>
+          <w:lang w:val="en-GB"/>
+        </w:rPr>
+        <w:t xml:space="preserve"> and the person/people involved.</w:t>
+      </w:r>
+    </w:p>
+    <w:p>
+      <w:pPr>
+        <w:rPr>
+          <w:lang w:val="en-GB"/>
+        </w:rPr>
+      </w:pPr>
+    </w:p>
+    <w:p>
+      <w:pPr>
+        <w:rPr>
+          <w:lang w:val="en-GB"/>
+        </w:rPr>
+      </w:pPr>
+      <w:r>
+        <w:rPr>
+          <w:noProof/>
+          <w:lang w:val="en-GB"/>
+        </w:rPr>
+        <w:drawing>
+          <wp:inline distT="0" distB="0" distL="0" distR="0" wp14:anchorId="5AF4E687" wp14:editId="48BC9451">
+            <wp:extent cx="5731510" cy="2592070"/>
+            <wp:effectExtent l="0" t="0" r="2540" b="0"/>
+            <wp:docPr id="991892066" name="Picture 14" descr="A screenshot of a person wearing headphones&#10;&#10;AI-generated content may be incorrect."/>
+            <wp:cNvGraphicFramePr>
+              <a:graphicFrameLocks xmlns:a="http://schemas.openxmlformats.org/drawingml/2006/main" noChangeAspect="1"/>
+            </wp:cNvGraphicFramePr>
+            <a:graphic xmlns:a="http://schemas.openxmlformats.org/drawingml/2006/main">
+              <a:graphicData uri="http://schemas.openxmlformats.org/drawingml/2006/picture">
+                <pic:pic xmlns:pic="http://schemas.openxmlformats.org/drawingml/2006/picture">
+                  <pic:nvPicPr>
+                    <pic:cNvPr id="991892066" name="Picture 14" descr="A screenshot of a person wearing headphones&#10;&#10;AI-generated content may be incorrect."/>
+                    <pic:cNvPicPr/>
+                  </pic:nvPicPr>
+                  <pic:blipFill>
+                    <a:blip r:embed="rId27" cstate="print">
+                      <a:extLst>
+                        <a:ext uri="{28A0092B-C50C-407E-A947-70E740481C1C}">
+                          <a14:useLocalDpi xmlns:a14="http://schemas.microsoft.com/office/drawing/2010/main" val="0"/>
+                        </a:ext>
+                      </a:extLst>
+                    </a:blip>
+                    <a:stretch>
+                      <a:fillRect/>
+                    </a:stretch>
+                  </pic:blipFill>
+                  <pic:spPr>
+                    <a:xfrm>
+                      <a:off x="0" y="0"/>
+                      <a:ext cx="5731510" cy="2592070"/>
+                    </a:xfrm>
+                    <a:prstGeom prst="rect">
+                      <a:avLst/>
+                    </a:prstGeom>
+                  </pic:spPr>
+                </pic:pic>
+              </a:graphicData>
+            </a:graphic>
+          </wp:inline>
+        </w:drawing>
+      </w:r>
     </w:p>
     <w:p>
       <w:pPr>
@@ -2337,6 +3250,7 @@
       </w:pPr>
       <w:bookmarkStart w:id="3" w:name="_Toc190422317"/>
       <w:r>
+        <w:lastRenderedPageBreak/>
         <w:t>Technologies</w:t>
       </w:r>
       <w:bookmarkEnd w:id="3"/>
@@ -2451,7 +3365,6 @@
           <w:bCs/>
           <w:lang w:val="en-GB"/>
         </w:rPr>
-        <w:lastRenderedPageBreak/>
         <w:t>Ultralytics</w:t>
       </w:r>
       <w:proofErr w:type="spellEnd"/>
@@ -2699,6 +3612,7 @@
       </w:pPr>
       <w:bookmarkStart w:id="4" w:name="_Toc190422318"/>
       <w:r>
+        <w:lastRenderedPageBreak/>
         <w:t>Demo Site &amp; Company Site</w:t>
       </w:r>
       <w:bookmarkEnd w:id="4"/>
@@ -2787,7 +3701,6 @@
           <w:bCs/>
           <w:lang w:val="en-GB"/>
         </w:rPr>
-        <w:lastRenderedPageBreak/>
         <w:t>Default Settings</w:t>
       </w:r>
       <w:r>
@@ -3003,6 +3916,7 @@
       </w:pPr>
       <w:bookmarkStart w:id="7" w:name="_Toc190422321"/>
       <w:r>
+        <w:lastRenderedPageBreak/>
         <w:t xml:space="preserve">Personal Protective Equipment </w:t>
       </w:r>
       <w:r>
@@ -3045,27 +3959,259 @@
         <w:rPr>
           <w:lang w:val="en-GB"/>
         </w:rPr>
+        <w:t>Recent advancements in machine learning provide a strong foundation for this system’s design. Helmet detection primarily involves analysing visual input to identify key features of helmets on individuals in a live video feed. Techniques such as object detection using convolutional neural networks (CNNs) have proven effective in similar applications.</w:t>
+      </w:r>
+    </w:p>
+    <w:p>
+      <w:pPr>
+        <w:rPr>
+          <w:lang w:val="en-GB"/>
+        </w:rPr>
+      </w:pPr>
+      <w:r>
+        <w:rPr>
+          <w:lang w:val="en-GB"/>
+        </w:rPr>
+        <w:t>Focusing</w:t>
+      </w:r>
+      <w:r>
+        <w:rPr>
+          <w:lang w:val="en-GB"/>
+        </w:rPr>
+        <w:t xml:space="preserve"> on helmets allows for a more streamlined and accurate first iteration. For this reason, the initial implementation will prioriti</w:t>
+      </w:r>
+      <w:r>
+        <w:rPr>
+          <w:lang w:val="en-GB"/>
+        </w:rPr>
+        <w:t>s</w:t>
+      </w:r>
+      <w:r>
+        <w:rPr>
+          <w:lang w:val="en-GB"/>
+        </w:rPr>
+        <w:t>e helmet detection based on trained object detection models, such as YOLO (You Only Look Once), due to its speed and precision in real-time environments.</w:t>
+      </w:r>
+    </w:p>
+    <w:p>
+      <w:pPr>
+        <w:rPr>
+          <w:lang w:val="en-GB"/>
+        </w:rPr>
+      </w:pPr>
+      <w:r>
+        <w:rPr>
+          <w:lang w:val="en-GB"/>
+        </w:rPr>
+        <w:t xml:space="preserve">Subsequent iterations of the system </w:t>
+      </w:r>
+      <w:r>
+        <w:rPr>
+          <w:lang w:val="en-GB"/>
+        </w:rPr>
+        <w:t>will</w:t>
+      </w:r>
+      <w:r>
+        <w:rPr>
+          <w:lang w:val="en-GB"/>
+        </w:rPr>
+        <w:t xml:space="preserve"> expand to include </w:t>
+      </w:r>
+      <w:r>
+        <w:rPr>
+          <w:lang w:val="en-GB"/>
+        </w:rPr>
+        <w:t>high-visibility jackets</w:t>
+      </w:r>
+      <w:r>
+        <w:rPr>
+          <w:lang w:val="en-GB"/>
+        </w:rPr>
+        <w:t xml:space="preserve"> alongside helmets. </w:t>
+      </w:r>
+      <w:r>
+        <w:t>Research has shown that combining multiple safety indicators can significantly enhance the overall reliability of site safety systems (</w:t>
+      </w:r>
+      <w:r>
+        <w:t xml:space="preserve">Fig 4. </w:t>
+      </w:r>
+      <w:r>
+        <w:t>Work Health Safety Research, 2015).</w:t>
+      </w:r>
+      <w:r>
+        <w:rPr>
+          <w:lang w:val="en-GB"/>
+        </w:rPr>
+        <w:t xml:space="preserve"> </w:t>
+      </w:r>
+      <w:r>
+        <w:rPr>
+          <w:lang w:val="en-GB"/>
+        </w:rPr>
+        <w:t>By starting with helmets as the primary focus, this project aims to deliver high accuracy and responsiveness, laying the groundwork for broader functionality in future updates.</w:t>
+      </w:r>
+    </w:p>
+    <w:p/>
+    <w:p>
+      <w:pPr>
+        <w:pStyle w:val="Heading2"/>
+      </w:pPr>
+      <w:bookmarkStart w:id="9" w:name="_Toc190422323"/>
+      <w:r>
+        <w:t>High-Visibility Jacket Detection</w:t>
+      </w:r>
+      <w:bookmarkEnd w:id="9"/>
+    </w:p>
+    <w:p>
+      <w:pPr>
+        <w:rPr>
+          <w:lang w:val="en-GB"/>
+        </w:rPr>
+      </w:pPr>
+    </w:p>
+    <w:p>
+      <w:pPr>
+        <w:rPr>
+          <w:lang w:val="en-GB"/>
+        </w:rPr>
+      </w:pPr>
+      <w:r>
+        <w:rPr>
+          <w:lang w:val="en-GB"/>
+        </w:rPr>
+        <w:t>The detection of high-visibility jackets is a vital component of ensuring worker compliance with safety regulations on construction sites. The chosen methodology for identifying high-visibility jackets relies on leveraging object detection models trained to recogni</w:t>
+      </w:r>
+      <w:r>
+        <w:rPr>
+          <w:lang w:val="en-GB"/>
+        </w:rPr>
+        <w:t>s</w:t>
+      </w:r>
+      <w:r>
+        <w:rPr>
+          <w:lang w:val="en-GB"/>
+        </w:rPr>
+        <w:t xml:space="preserve">e the unique </w:t>
+      </w:r>
+      <w:r>
+        <w:rPr>
+          <w:lang w:val="en-GB"/>
+        </w:rPr>
+        <w:t>colour</w:t>
+      </w:r>
+      <w:r>
+        <w:rPr>
+          <w:lang w:val="en-GB"/>
+        </w:rPr>
+        <w:t xml:space="preserve">, shape and </w:t>
+      </w:r>
+      <w:r>
+        <w:rPr>
+          <w:lang w:val="en-GB"/>
+        </w:rPr>
+        <w:t>reflective properties of such jackets.</w:t>
+      </w:r>
+    </w:p>
+    <w:p>
+      <w:pPr>
+        <w:rPr>
+          <w:lang w:val="en-GB"/>
+        </w:rPr>
+      </w:pPr>
+      <w:r>
+        <w:rPr>
+          <w:lang w:val="en-GB"/>
+        </w:rPr>
+        <w:t xml:space="preserve">Object detection libraries and frameworks provide the foundation for this functionality. Pretrained models like YOLO (You Only Look Once) have been evaluated for their suitability in identifying </w:t>
+      </w:r>
+      <w:r>
+        <w:rPr>
+          <w:lang w:val="en-GB"/>
+        </w:rPr>
+        <w:t>helmets, transitioning this to high-visibility jackets should be achievable.</w:t>
+      </w:r>
+      <w:r>
+        <w:rPr>
+          <w:lang w:val="en-GB"/>
+        </w:rPr>
+        <w:t xml:space="preserve"> YOLO is particularly advantageous due to its ability to process frames in real-time, a crucial feature for live video monitoring.</w:t>
+      </w:r>
+    </w:p>
+    <w:p>
+      <w:pPr>
+        <w:rPr>
+          <w:lang w:val="en-GB"/>
+        </w:rPr>
+      </w:pPr>
+      <w:r>
+        <w:rPr>
+          <w:lang w:val="en-GB"/>
+        </w:rPr>
         <w:lastRenderedPageBreak/>
-        <w:t>Recent advancements in machine learning provide a strong foundation for this system’s design. Helmet detection primarily involves analysing visual input to identify key features of helmets on individuals in a live video feed. Techniques such as object detection using convolutional neural networks (CNNs) have proven effective in similar applications.</w:t>
-      </w:r>
-    </w:p>
-    <w:p>
-      <w:pPr>
-        <w:rPr>
-          <w:lang w:val="en-GB"/>
-        </w:rPr>
-      </w:pPr>
-      <w:r>
-        <w:rPr>
-          <w:lang w:val="en-GB"/>
-        </w:rPr>
-        <w:t>Focusing</w:t>
-      </w:r>
-      <w:r>
-        <w:rPr>
-          <w:lang w:val="en-GB"/>
-        </w:rPr>
-        <w:t xml:space="preserve"> on helmets allows for a more streamlined and accurate first iteration. For this reason, the initial implementation will prioriti</w:t>
+        <w:t xml:space="preserve">For initial implementation, YOLO will be employed for its speed and compatibility with a range of </w:t>
+      </w:r>
+      <w:r>
+        <w:rPr>
+          <w:lang w:val="en-GB"/>
+        </w:rPr>
+        <w:t>camera sources</w:t>
+      </w:r>
+      <w:r>
+        <w:rPr>
+          <w:lang w:val="en-GB"/>
+        </w:rPr>
+        <w:t xml:space="preserve">. The system will be trained using datasets containing diverse examples of high-visibility jackets across varying lighting and weather conditions to ensure robustness. One limitation of YOLO, however, is that its accuracy may decrease when distinguishing between jackets and similarly </w:t>
+      </w:r>
+      <w:r>
+        <w:rPr>
+          <w:lang w:val="en-GB"/>
+        </w:rPr>
+        <w:t>coloured</w:t>
+      </w:r>
+      <w:r>
+        <w:rPr>
+          <w:lang w:val="en-GB"/>
+        </w:rPr>
+        <w:t xml:space="preserve"> or reflective objects, which will be addressed through iterative model refinement.</w:t>
+      </w:r>
+    </w:p>
+    <w:p>
+      <w:pPr>
+        <w:pStyle w:val="Heading2"/>
+      </w:pPr>
+      <w:bookmarkStart w:id="10" w:name="_Toc190422324"/>
+      <w:r>
+        <w:t>Evaluation</w:t>
+      </w:r>
+      <w:r>
+        <w:t xml:space="preserve"> of detection model</w:t>
+      </w:r>
+      <w:bookmarkEnd w:id="10"/>
+    </w:p>
+    <w:p/>
+    <w:p>
+      <w:pPr>
+        <w:rPr>
+          <w:lang w:val="en-GB"/>
+        </w:rPr>
+      </w:pPr>
+      <w:r>
+        <w:rPr>
+          <w:lang w:val="en-GB"/>
+        </w:rPr>
+        <w:t>The evaluation of detection models for helmets and high-visibility jackets will focus on key performance metrics to ensure the system meets safety monitoring standards. Metrics such as</w:t>
+      </w:r>
+      <w:r>
+        <w:rPr>
+          <w:lang w:val="en-GB"/>
+        </w:rPr>
+        <w:t xml:space="preserve"> confusion matrix,</w:t>
+      </w:r>
+      <w:r>
+        <w:rPr>
+          <w:lang w:val="en-GB"/>
+        </w:rPr>
+        <w:t xml:space="preserve"> precision, recall, and the F1-score will be used to assess the balance between the model's accuracy and its ability to minimi</w:t>
       </w:r>
       <w:r>
         <w:rPr>
@@ -3077,246 +4223,7 @@
         <w:rPr>
           <w:lang w:val="en-GB"/>
         </w:rPr>
-        <w:t>e helmet detection based on trained object detection models, such as YOLO (You Only Look Once), due to its speed and precision in real-time environments.</w:t>
-      </w:r>
-    </w:p>
-    <w:p>
-      <w:pPr>
-        <w:rPr>
-          <w:lang w:val="en-GB"/>
-        </w:rPr>
-      </w:pPr>
-      <w:r>
-        <w:rPr>
-          <w:lang w:val="en-GB"/>
-        </w:rPr>
-        <w:t xml:space="preserve">Subsequent iterations of the system </w:t>
-      </w:r>
-      <w:r>
-        <w:rPr>
-          <w:lang w:val="en-GB"/>
-        </w:rPr>
-        <w:t>will</w:t>
-      </w:r>
-      <w:r>
-        <w:rPr>
-          <w:lang w:val="en-GB"/>
-        </w:rPr>
-        <w:t xml:space="preserve"> expand to include </w:t>
-      </w:r>
-      <w:r>
-        <w:rPr>
-          <w:lang w:val="en-GB"/>
-        </w:rPr>
-        <w:t>high-visibility jackets</w:t>
-      </w:r>
-      <w:r>
-        <w:rPr>
-          <w:lang w:val="en-GB"/>
-        </w:rPr>
-        <w:t xml:space="preserve"> alongside helmets. </w:t>
-      </w:r>
-      <w:r>
-        <w:t>Research has shown that combining multiple safety indicators can significantly enhance the overall reliability of site safety systems (</w:t>
-      </w:r>
-      <w:r>
-        <w:t xml:space="preserve">Fig 4. </w:t>
-      </w:r>
-      <w:r>
-        <w:t>Work Health Safety Research, 2015).</w:t>
-      </w:r>
-      <w:r>
-        <w:rPr>
-          <w:lang w:val="en-GB"/>
-        </w:rPr>
-        <w:t xml:space="preserve"> </w:t>
-      </w:r>
-      <w:r>
-        <w:rPr>
-          <w:lang w:val="en-GB"/>
-        </w:rPr>
-        <w:t>By starting with helmets as the primary focus, this project aims to deliver high accuracy and responsiveness, laying the groundwork for broader functionality in future updates.</w:t>
-      </w:r>
-    </w:p>
-    <w:p/>
-    <w:p>
-      <w:pPr>
-        <w:pStyle w:val="Heading2"/>
-      </w:pPr>
-      <w:bookmarkStart w:id="9" w:name="_Toc190422323"/>
-      <w:r>
-        <w:t>High-Visibility Jacket Detection</w:t>
-      </w:r>
-      <w:bookmarkEnd w:id="9"/>
-    </w:p>
-    <w:p>
-      <w:pPr>
-        <w:rPr>
-          <w:lang w:val="en-GB"/>
-        </w:rPr>
-      </w:pPr>
-    </w:p>
-    <w:p>
-      <w:pPr>
-        <w:rPr>
-          <w:lang w:val="en-GB"/>
-        </w:rPr>
-      </w:pPr>
-      <w:r>
-        <w:rPr>
-          <w:lang w:val="en-GB"/>
-        </w:rPr>
-        <w:t>The detection of high-visibility jackets is a vital component of ensuring worker compliance with safety regulations on construction sites. The chosen methodology for identifying high-visibility jackets relies on leveraging object detection models trained to recogni</w:t>
-      </w:r>
-      <w:r>
-        <w:rPr>
-          <w:lang w:val="en-GB"/>
-        </w:rPr>
-        <w:t>s</w:t>
-      </w:r>
-      <w:r>
-        <w:rPr>
-          <w:lang w:val="en-GB"/>
-        </w:rPr>
-        <w:t xml:space="preserve">e the unique </w:t>
-      </w:r>
-      <w:r>
-        <w:rPr>
-          <w:lang w:val="en-GB"/>
-        </w:rPr>
-        <w:t>colour</w:t>
-      </w:r>
-      <w:r>
-        <w:rPr>
-          <w:lang w:val="en-GB"/>
-        </w:rPr>
-        <w:t xml:space="preserve">, shape and </w:t>
-      </w:r>
-      <w:r>
-        <w:rPr>
-          <w:lang w:val="en-GB"/>
-        </w:rPr>
-        <w:t>reflective properties of such jackets.</w:t>
-      </w:r>
-    </w:p>
-    <w:p>
-      <w:pPr>
-        <w:rPr>
-          <w:lang w:val="en-GB"/>
-        </w:rPr>
-      </w:pPr>
-      <w:r>
-        <w:rPr>
-          <w:lang w:val="en-GB"/>
-        </w:rPr>
-        <w:t xml:space="preserve">Object detection libraries and frameworks provide the foundation for this functionality. Pretrained models like YOLO (You Only Look Once) have been evaluated for their suitability in identifying </w:t>
-      </w:r>
-      <w:r>
-        <w:rPr>
-          <w:lang w:val="en-GB"/>
-        </w:rPr>
-        <w:t>helmets, transitioning this to high-visibility jackets should be achievable.</w:t>
-      </w:r>
-      <w:r>
-        <w:rPr>
-          <w:lang w:val="en-GB"/>
-        </w:rPr>
-        <w:t xml:space="preserve"> YOLO is particularly advantageous due to its ability to process frames in real-time, a crucial feature for live video monitoring.</w:t>
-      </w:r>
-    </w:p>
-    <w:p>
-      <w:pPr>
-        <w:rPr>
-          <w:lang w:val="en-GB"/>
-        </w:rPr>
-      </w:pPr>
-      <w:r>
-        <w:rPr>
-          <w:lang w:val="en-GB"/>
-        </w:rPr>
-        <w:t xml:space="preserve">For initial implementation, YOLO will be employed for its speed and compatibility with a range of </w:t>
-      </w:r>
-      <w:r>
-        <w:rPr>
-          <w:lang w:val="en-GB"/>
-        </w:rPr>
-        <w:t>camera sources</w:t>
-      </w:r>
-      <w:r>
-        <w:rPr>
-          <w:lang w:val="en-GB"/>
-        </w:rPr>
-        <w:t xml:space="preserve">. The system will be trained using datasets containing diverse examples of high-visibility jackets across varying lighting and weather conditions to ensure robustness. One limitation of YOLO, however, is that its accuracy may decrease when distinguishing between jackets and similarly </w:t>
-      </w:r>
-      <w:r>
-        <w:rPr>
-          <w:lang w:val="en-GB"/>
-        </w:rPr>
-        <w:t>coloured</w:t>
-      </w:r>
-      <w:r>
-        <w:rPr>
-          <w:lang w:val="en-GB"/>
-        </w:rPr>
-        <w:t xml:space="preserve"> or reflective objects, which will be addressed through iterative model refinement.</w:t>
-      </w:r>
-    </w:p>
-    <w:p>
-      <w:pPr>
-        <w:pStyle w:val="Heading2"/>
-      </w:pPr>
-      <w:bookmarkStart w:id="10" w:name="_Toc190422324"/>
-      <w:r>
-        <w:t>Evaluation</w:t>
-      </w:r>
-      <w:r>
-        <w:t xml:space="preserve"> of detection model</w:t>
-      </w:r>
-      <w:bookmarkEnd w:id="10"/>
-    </w:p>
-    <w:p/>
-    <w:p>
-      <w:pPr>
-        <w:rPr>
-          <w:lang w:val="en-GB"/>
-        </w:rPr>
-      </w:pPr>
-      <w:r>
-        <w:rPr>
-          <w:lang w:val="en-GB"/>
-        </w:rPr>
-        <w:t>The evaluation of detection models for helmets and high-visibility jackets will focus on key performance metrics to ensure the system meets safety monitoring standards. Metrics such as</w:t>
-      </w:r>
-      <w:r>
-        <w:rPr>
-          <w:lang w:val="en-GB"/>
-        </w:rPr>
-        <w:t xml:space="preserve"> confusion matrix,</w:t>
-      </w:r>
-      <w:r>
-        <w:rPr>
-          <w:lang w:val="en-GB"/>
-        </w:rPr>
-        <w:t xml:space="preserve"> precision, recall, and the F1-score will be used to assess the balance between the model's accuracy and its ability to minimi</w:t>
-      </w:r>
-      <w:r>
-        <w:rPr>
-          <w:lang w:val="en-GB"/>
-        </w:rPr>
-        <w:t>s</w:t>
-      </w:r>
-      <w:r>
-        <w:rPr>
-          <w:lang w:val="en-GB"/>
-        </w:rPr>
-        <w:t xml:space="preserve">e false </w:t>
-      </w:r>
-      <w:r>
-        <w:rPr>
-          <w:lang w:val="en-GB"/>
-        </w:rPr>
-        <w:lastRenderedPageBreak/>
-        <w:t>positives and false negatives. A confusion matrix will provide a detailed breakdown of true positives, false positives, true negatives, and false negatives, offering insights into areas of improvement for the model.</w:t>
+        <w:t>e false positives and false negatives. A confusion matrix will provide a detailed breakdown of true positives, false positives, true negatives, and false negatives, offering insights into areas of improvement for the model.</w:t>
       </w:r>
     </w:p>
     <w:p>
@@ -3457,7 +4364,7 @@
                     </pic:cNvPicPr>
                   </pic:nvPicPr>
                   <pic:blipFill>
-                    <a:blip r:embed="rId18" cstate="print">
+                    <a:blip r:embed="rId28" cstate="print">
                       <a:extLst>
                         <a:ext uri="{28A0092B-C50C-407E-A947-70E740481C1C}">
                           <a14:useLocalDpi xmlns:a14="http://schemas.microsoft.com/office/drawing/2010/main" val="0"/>
@@ -3563,6 +4470,7 @@
         <w:rPr>
           <w:noProof/>
         </w:rPr>
+        <w:lastRenderedPageBreak/>
         <w:drawing>
           <wp:anchor distT="0" distB="0" distL="114300" distR="114300" simplePos="0" relativeHeight="251802624" behindDoc="0" locked="0" layoutInCell="1" allowOverlap="1" wp14:anchorId="2B88D112" wp14:editId="6A698C96">
             <wp:simplePos x="0" y="0"/>
@@ -3589,7 +4497,7 @@
                     </pic:cNvPicPr>
                   </pic:nvPicPr>
                   <pic:blipFill>
-                    <a:blip r:embed="rId19" cstate="print">
+                    <a:blip r:embed="rId29" cstate="print">
                       <a:extLst>
                         <a:ext uri="{28A0092B-C50C-407E-A947-70E740481C1C}">
                           <a14:useLocalDpi xmlns:a14="http://schemas.microsoft.com/office/drawing/2010/main" val="0"/>
@@ -3777,7 +4685,7 @@
                     </pic:cNvPicPr>
                   </pic:nvPicPr>
                   <pic:blipFill>
-                    <a:blip r:embed="rId20" cstate="print">
+                    <a:blip r:embed="rId30" cstate="print">
                       <a:extLst>
                         <a:ext uri="{28A0092B-C50C-407E-A947-70E740481C1C}">
                           <a14:useLocalDpi xmlns:a14="http://schemas.microsoft.com/office/drawing/2010/main" val="0"/>
@@ -3855,7 +4763,7 @@
                     </pic:cNvPicPr>
                   </pic:nvPicPr>
                   <pic:blipFill>
-                    <a:blip r:embed="rId21" cstate="print">
+                    <a:blip r:embed="rId31" cstate="print">
                       <a:extLst>
                         <a:ext uri="{28A0092B-C50C-407E-A947-70E740481C1C}">
                           <a14:useLocalDpi xmlns:a14="http://schemas.microsoft.com/office/drawing/2010/main" val="0"/>
@@ -3932,7 +4840,7 @@
                     </pic:cNvPicPr>
                   </pic:nvPicPr>
                   <pic:blipFill>
-                    <a:blip r:embed="rId22" cstate="print">
+                    <a:blip r:embed="rId32" cstate="print">
                       <a:extLst>
                         <a:ext uri="{28A0092B-C50C-407E-A947-70E740481C1C}">
                           <a14:useLocalDpi xmlns:a14="http://schemas.microsoft.com/office/drawing/2010/main" val="0"/>
@@ -4267,7 +5175,7 @@
           <w:lang w:val="en-GB"/>
         </w:rPr>
         <w:drawing>
-          <wp:anchor distT="0" distB="0" distL="114300" distR="114300" simplePos="0" relativeHeight="251804672" behindDoc="0" locked="0" layoutInCell="1" allowOverlap="1" wp14:anchorId="69356E40" wp14:editId="78337639">
+          <wp:anchor distT="0" distB="0" distL="114300" distR="114300" simplePos="0" relativeHeight="251804672" behindDoc="0" locked="0" layoutInCell="1" allowOverlap="1" wp14:anchorId="69356E40" wp14:editId="2F0B13C7">
             <wp:simplePos x="0" y="0"/>
             <wp:positionH relativeFrom="column">
               <wp:posOffset>-441960</wp:posOffset>
@@ -4292,7 +5200,7 @@
                     </pic:cNvPicPr>
                   </pic:nvPicPr>
                   <pic:blipFill>
-                    <a:blip r:embed="rId23" cstate="print">
+                    <a:blip r:embed="rId33" cstate="print">
                       <a:extLst>
                         <a:ext uri="{28A0092B-C50C-407E-A947-70E740481C1C}">
                           <a14:useLocalDpi xmlns:a14="http://schemas.microsoft.com/office/drawing/2010/main" val="0"/>
@@ -4460,7 +5368,7 @@
                     </pic:cNvPicPr>
                   </pic:nvPicPr>
                   <pic:blipFill>
-                    <a:blip r:embed="rId24" cstate="print">
+                    <a:blip r:embed="rId34" cstate="print">
                       <a:extLst>
                         <a:ext uri="{28A0092B-C50C-407E-A947-70E740481C1C}">
                           <a14:useLocalDpi xmlns:a14="http://schemas.microsoft.com/office/drawing/2010/main" val="0"/>
@@ -5367,7 +6275,7 @@
                     </pic:cNvPicPr>
                   </pic:nvPicPr>
                   <pic:blipFill>
-                    <a:blip r:embed="rId25">
+                    <a:blip r:embed="rId35">
                       <a:extLst>
                         <a:ext uri="{28A0092B-C50C-407E-A947-70E740481C1C}">
                           <a14:useLocalDpi xmlns:a14="http://schemas.microsoft.com/office/drawing/2010/main" val="0"/>
@@ -5453,7 +6361,7 @@
             <wp:cNvGraphicFramePr/>
             <a:graphic xmlns:a="http://schemas.openxmlformats.org/drawingml/2006/main">
               <a:graphicData uri="http://schemas.openxmlformats.org/drawingml/2006/diagram">
-                <dgm:relIds xmlns:dgm="http://schemas.openxmlformats.org/drawingml/2006/diagram" xmlns:r="http://schemas.openxmlformats.org/officeDocument/2006/relationships" r:dm="rId26" r:lo="rId27" r:qs="rId28" r:cs="rId29"/>
+                <dgm:relIds xmlns:dgm="http://schemas.openxmlformats.org/drawingml/2006/diagram" xmlns:r="http://schemas.openxmlformats.org/officeDocument/2006/relationships" r:dm="rId36" r:lo="rId37" r:qs="rId38" r:cs="rId39"/>
               </a:graphicData>
             </a:graphic>
           </wp:inline>
@@ -5490,7 +6398,7 @@
             <wp:cNvGraphicFramePr/>
             <a:graphic xmlns:a="http://schemas.openxmlformats.org/drawingml/2006/main">
               <a:graphicData uri="http://schemas.openxmlformats.org/drawingml/2006/diagram">
-                <dgm:relIds xmlns:dgm="http://schemas.openxmlformats.org/drawingml/2006/diagram" xmlns:r="http://schemas.openxmlformats.org/officeDocument/2006/relationships" r:dm="rId31" r:lo="rId32" r:qs="rId33" r:cs="rId34"/>
+                <dgm:relIds xmlns:dgm="http://schemas.openxmlformats.org/drawingml/2006/diagram" xmlns:r="http://schemas.openxmlformats.org/officeDocument/2006/relationships" r:dm="rId41" r:lo="rId42" r:qs="rId43" r:cs="rId44"/>
               </a:graphicData>
             </a:graphic>
           </wp:inline>
@@ -5527,7 +6435,7 @@
             <wp:cNvGraphicFramePr/>
             <a:graphic xmlns:a="http://schemas.openxmlformats.org/drawingml/2006/main">
               <a:graphicData uri="http://schemas.openxmlformats.org/drawingml/2006/diagram">
-                <dgm:relIds xmlns:dgm="http://schemas.openxmlformats.org/drawingml/2006/diagram" xmlns:r="http://schemas.openxmlformats.org/officeDocument/2006/relationships" r:dm="rId36" r:lo="rId37" r:qs="rId38" r:cs="rId39"/>
+                <dgm:relIds xmlns:dgm="http://schemas.openxmlformats.org/drawingml/2006/diagram" xmlns:r="http://schemas.openxmlformats.org/officeDocument/2006/relationships" r:dm="rId46" r:lo="rId47" r:qs="rId48" r:cs="rId49"/>
               </a:graphicData>
             </a:graphic>
           </wp:inline>
@@ -5564,7 +6472,7 @@
             <wp:cNvGraphicFramePr/>
             <a:graphic xmlns:a="http://schemas.openxmlformats.org/drawingml/2006/main">
               <a:graphicData uri="http://schemas.openxmlformats.org/drawingml/2006/diagram">
-                <dgm:relIds xmlns:dgm="http://schemas.openxmlformats.org/drawingml/2006/diagram" xmlns:r="http://schemas.openxmlformats.org/officeDocument/2006/relationships" r:dm="rId41" r:lo="rId42" r:qs="rId43" r:cs="rId44"/>
+                <dgm:relIds xmlns:dgm="http://schemas.openxmlformats.org/drawingml/2006/diagram" xmlns:r="http://schemas.openxmlformats.org/officeDocument/2006/relationships" r:dm="rId51" r:lo="rId52" r:qs="rId53" r:cs="rId54"/>
               </a:graphicData>
             </a:graphic>
           </wp:inline>
@@ -5659,7 +6567,7 @@
                     </pic:cNvPicPr>
                   </pic:nvPicPr>
                   <pic:blipFill>
-                    <a:blip r:embed="rId46" cstate="print">
+                    <a:blip r:embed="rId56" cstate="print">
                       <a:extLst>
                         <a:ext uri="{28A0092B-C50C-407E-A947-70E740481C1C}">
                           <a14:useLocalDpi xmlns:a14="http://schemas.microsoft.com/office/drawing/2010/main" val="0"/>
@@ -5737,7 +6645,7 @@
                     </pic:cNvPicPr>
                   </pic:nvPicPr>
                   <pic:blipFill>
-                    <a:blip r:embed="rId47" cstate="print">
+                    <a:blip r:embed="rId57" cstate="print">
                       <a:extLst>
                         <a:ext uri="{28A0092B-C50C-407E-A947-70E740481C1C}">
                           <a14:useLocalDpi xmlns:a14="http://schemas.microsoft.com/office/drawing/2010/main" val="0"/>
@@ -5809,7 +6717,7 @@
                     </pic:cNvPicPr>
                   </pic:nvPicPr>
                   <pic:blipFill>
-                    <a:blip r:embed="rId48" cstate="print">
+                    <a:blip r:embed="rId58" cstate="print">
                       <a:extLst>
                         <a:ext uri="{28A0092B-C50C-407E-A947-70E740481C1C}">
                           <a14:useLocalDpi xmlns:a14="http://schemas.microsoft.com/office/drawing/2010/main" val="0"/>
@@ -5884,7 +6792,7 @@
                     </pic:cNvPicPr>
                   </pic:nvPicPr>
                   <pic:blipFill>
-                    <a:blip r:embed="rId49" cstate="print">
+                    <a:blip r:embed="rId59" cstate="print">
                       <a:extLst>
                         <a:ext uri="{28A0092B-C50C-407E-A947-70E740481C1C}">
                           <a14:useLocalDpi xmlns:a14="http://schemas.microsoft.com/office/drawing/2010/main" val="0"/>
@@ -5959,7 +6867,7 @@
                     </pic:cNvPicPr>
                   </pic:nvPicPr>
                   <pic:blipFill>
-                    <a:blip r:embed="rId50" cstate="print">
+                    <a:blip r:embed="rId60" cstate="print">
                       <a:extLst>
                         <a:ext uri="{28A0092B-C50C-407E-A947-70E740481C1C}">
                           <a14:useLocalDpi xmlns:a14="http://schemas.microsoft.com/office/drawing/2010/main" val="0"/>
@@ -6018,7 +6926,7 @@
                     </pic:cNvPicPr>
                   </pic:nvPicPr>
                   <pic:blipFill>
-                    <a:blip r:embed="rId51" cstate="print">
+                    <a:blip r:embed="rId61" cstate="print">
                       <a:extLst>
                         <a:ext uri="{28A0092B-C50C-407E-A947-70E740481C1C}">
                           <a14:useLocalDpi xmlns:a14="http://schemas.microsoft.com/office/drawing/2010/main" val="0"/>
@@ -6092,7 +7000,7 @@
                     </pic:cNvPicPr>
                   </pic:nvPicPr>
                   <pic:blipFill>
-                    <a:blip r:embed="rId52" cstate="print">
+                    <a:blip r:embed="rId62" cstate="print">
                       <a:extLst>
                         <a:ext uri="{28A0092B-C50C-407E-A947-70E740481C1C}">
                           <a14:useLocalDpi xmlns:a14="http://schemas.microsoft.com/office/drawing/2010/main" val="0"/>
@@ -6159,7 +7067,7 @@
                     </pic:cNvPicPr>
                   </pic:nvPicPr>
                   <pic:blipFill>
-                    <a:blip r:embed="rId53" cstate="print">
+                    <a:blip r:embed="rId63" cstate="print">
                       <a:extLst>
                         <a:ext uri="{28A0092B-C50C-407E-A947-70E740481C1C}">
                           <a14:useLocalDpi xmlns:a14="http://schemas.microsoft.com/office/drawing/2010/main" val="0"/>
@@ -6238,7 +7146,7 @@
                     </pic:cNvPicPr>
                   </pic:nvPicPr>
                   <pic:blipFill>
-                    <a:blip r:embed="rId54">
+                    <a:blip r:embed="rId64">
                       <a:extLst>
                         <a:ext uri="{28A0092B-C50C-407E-A947-70E740481C1C}">
                           <a14:useLocalDpi xmlns:a14="http://schemas.microsoft.com/office/drawing/2010/main" val="0"/>
@@ -6466,7 +7374,7 @@
                     </pic:cNvPicPr>
                   </pic:nvPicPr>
                   <pic:blipFill>
-                    <a:blip r:embed="rId55">
+                    <a:blip r:embed="rId65">
                       <a:extLst>
                         <a:ext uri="{28A0092B-C50C-407E-A947-70E740481C1C}">
                           <a14:useLocalDpi xmlns:a14="http://schemas.microsoft.com/office/drawing/2010/main" val="0"/>
@@ -6680,7 +7588,7 @@
                     </pic:cNvPicPr>
                   </pic:nvPicPr>
                   <pic:blipFill>
-                    <a:blip r:embed="rId56">
+                    <a:blip r:embed="rId66">
                       <a:extLst>
                         <a:ext uri="{28A0092B-C50C-407E-A947-70E740481C1C}">
                           <a14:useLocalDpi xmlns:a14="http://schemas.microsoft.com/office/drawing/2010/main" val="0"/>
@@ -6865,7 +7773,7 @@
                     </pic:cNvPicPr>
                   </pic:nvPicPr>
                   <pic:blipFill>
-                    <a:blip r:embed="rId57">
+                    <a:blip r:embed="rId67">
                       <a:extLst>
                         <a:ext uri="{28A0092B-C50C-407E-A947-70E740481C1C}">
                           <a14:useLocalDpi xmlns:a14="http://schemas.microsoft.com/office/drawing/2010/main" val="0"/>
@@ -7058,7 +7966,7 @@
                     </pic:cNvPicPr>
                   </pic:nvPicPr>
                   <pic:blipFill>
-                    <a:blip r:embed="rId58">
+                    <a:blip r:embed="rId68">
                       <a:extLst>
                         <a:ext uri="{28A0092B-C50C-407E-A947-70E740481C1C}">
                           <a14:useLocalDpi xmlns:a14="http://schemas.microsoft.com/office/drawing/2010/main" val="0"/>
@@ -7157,7 +8065,7 @@
                     </pic:cNvPicPr>
                   </pic:nvPicPr>
                   <pic:blipFill>
-                    <a:blip r:embed="rId59">
+                    <a:blip r:embed="rId69">
                       <a:extLst>
                         <a:ext uri="{28A0092B-C50C-407E-A947-70E740481C1C}">
                           <a14:useLocalDpi xmlns:a14="http://schemas.microsoft.com/office/drawing/2010/main" val="0"/>
@@ -7431,7 +8339,7 @@
                     <pic:cNvPicPr/>
                   </pic:nvPicPr>
                   <pic:blipFill>
-                    <a:blip r:embed="rId60">
+                    <a:blip r:embed="rId70">
                       <a:extLst>
                         <a:ext uri="{28A0092B-C50C-407E-A947-70E740481C1C}">
                           <a14:useLocalDpi xmlns:a14="http://schemas.microsoft.com/office/drawing/2010/main" val="0"/>
@@ -7789,7 +8697,7 @@
                     <pic:cNvPicPr/>
                   </pic:nvPicPr>
                   <pic:blipFill>
-                    <a:blip r:embed="rId61">
+                    <a:blip r:embed="rId71">
                       <a:extLst>
                         <a:ext uri="{28A0092B-C50C-407E-A947-70E740481C1C}">
                           <a14:useLocalDpi xmlns:a14="http://schemas.microsoft.com/office/drawing/2010/main" val="0"/>
@@ -7875,7 +8783,7 @@
                     <pic:cNvPicPr/>
                   </pic:nvPicPr>
                   <pic:blipFill>
-                    <a:blip r:embed="rId62">
+                    <a:blip r:embed="rId72">
                       <a:extLst>
                         <a:ext uri="{28A0092B-C50C-407E-A947-70E740481C1C}">
                           <a14:useLocalDpi xmlns:a14="http://schemas.microsoft.com/office/drawing/2010/main" val="0"/>
@@ -7935,7 +8843,7 @@
                     <pic:cNvPicPr/>
                   </pic:nvPicPr>
                   <pic:blipFill>
-                    <a:blip r:embed="rId63">
+                    <a:blip r:embed="rId73">
                       <a:extLst>
                         <a:ext uri="{28A0092B-C50C-407E-A947-70E740481C1C}">
                           <a14:useLocalDpi xmlns:a14="http://schemas.microsoft.com/office/drawing/2010/main" val="0"/>
@@ -8002,7 +8910,7 @@
                     <pic:cNvPicPr/>
                   </pic:nvPicPr>
                   <pic:blipFill>
-                    <a:blip r:embed="rId64">
+                    <a:blip r:embed="rId74">
                       <a:extLst>
                         <a:ext uri="{28A0092B-C50C-407E-A947-70E740481C1C}">
                           <a14:useLocalDpi xmlns:a14="http://schemas.microsoft.com/office/drawing/2010/main" val="0"/>
@@ -8105,7 +9013,7 @@
         </w:rPr>
         <w:t xml:space="preserve">Fig 1. SETU Logo: </w:t>
       </w:r>
-      <w:hyperlink r:id="rId65" w:tgtFrame="_new" w:history="1">
+      <w:hyperlink r:id="rId75" w:tgtFrame="_new" w:history="1">
         <w:r>
           <w:rPr>
             <w:rStyle w:val="Hyperlink"/>
@@ -8157,7 +9065,7 @@
         </w:rPr>
         <w:t xml:space="preserve"> </w:t>
       </w:r>
-      <w:hyperlink r:id="rId66" w:history="1">
+      <w:hyperlink r:id="rId76" w:history="1">
         <w:r>
           <w:rPr>
             <w:rStyle w:val="Hyperlink"/>
@@ -8191,7 +9099,7 @@
         </w:rPr>
         <w:t xml:space="preserve">: </w:t>
       </w:r>
-      <w:hyperlink r:id="rId67" w:history="1">
+      <w:hyperlink r:id="rId77" w:history="1">
         <w:r>
           <w:rPr>
             <w:rStyle w:val="Hyperlink"/>
@@ -8229,7 +9137,7 @@
         </w:rPr>
         <w:t xml:space="preserve">: </w:t>
       </w:r>
-      <w:hyperlink r:id="rId68" w:history="1">
+      <w:hyperlink r:id="rId78" w:history="1">
         <w:r>
           <w:rPr>
             <w:rStyle w:val="Hyperlink"/>
@@ -8245,7 +9153,7 @@
       <w:r>
         <w:t xml:space="preserve">Fig 5. YOLO Training Code: </w:t>
       </w:r>
-      <w:hyperlink r:id="rId69" w:history="1">
+      <w:hyperlink r:id="rId79" w:history="1">
         <w:r>
           <w:rPr>
             <w:rStyle w:val="Hyperlink"/>
@@ -8303,7 +9211,7 @@
         </w:rPr>
         <w:t xml:space="preserve"> </w:t>
       </w:r>
-      <w:hyperlink r:id="rId70" w:tgtFrame="_new" w:history="1">
+      <w:hyperlink r:id="rId80" w:tgtFrame="_new" w:history="1">
         <w:r>
           <w:rPr>
             <w:rStyle w:val="Hyperlink"/>
@@ -8350,7 +9258,7 @@
         </w:rPr>
         <w:t xml:space="preserve"> </w:t>
       </w:r>
-      <w:hyperlink r:id="rId71" w:history="1">
+      <w:hyperlink r:id="rId81" w:history="1">
         <w:r>
           <w:rPr>
             <w:rStyle w:val="Hyperlink"/>
@@ -8393,7 +9301,7 @@
         </w:rPr>
         <w:t xml:space="preserve">: </w:t>
       </w:r>
-      <w:hyperlink r:id="rId72" w:history="1">
+      <w:hyperlink r:id="rId82" w:history="1">
         <w:r>
           <w:rPr>
             <w:rStyle w:val="Hyperlink"/>
@@ -8434,7 +9342,7 @@
         </w:rPr>
         <w:t xml:space="preserve">: </w:t>
       </w:r>
-      <w:hyperlink r:id="rId73" w:history="1">
+      <w:hyperlink r:id="rId83" w:history="1">
         <w:r>
           <w:rPr>
             <w:rStyle w:val="Hyperlink"/>
@@ -8475,7 +9383,7 @@
         </w:rPr>
         <w:t xml:space="preserve">: </w:t>
       </w:r>
-      <w:hyperlink r:id="rId74" w:history="1">
+      <w:hyperlink r:id="rId84" w:history="1">
         <w:r>
           <w:rPr>
             <w:rStyle w:val="Hyperlink"/>
@@ -8516,7 +9424,7 @@
         </w:rPr>
         <w:t xml:space="preserve">: </w:t>
       </w:r>
-      <w:hyperlink r:id="rId75" w:history="1">
+      <w:hyperlink r:id="rId85" w:history="1">
         <w:r>
           <w:rPr>
             <w:rStyle w:val="Hyperlink"/>
@@ -8563,7 +9471,7 @@
         </w:rPr>
         <w:t xml:space="preserve"> </w:t>
       </w:r>
-      <w:hyperlink r:id="rId76" w:history="1">
+      <w:hyperlink r:id="rId86" w:history="1">
         <w:r>
           <w:rPr>
             <w:rStyle w:val="Hyperlink"/>
@@ -8612,7 +9520,7 @@
         </w:rPr>
         <w:t xml:space="preserve"> </w:t>
       </w:r>
-      <w:hyperlink r:id="rId77" w:tgtFrame="_new" w:history="1">
+      <w:hyperlink r:id="rId87" w:tgtFrame="_new" w:history="1">
         <w:r>
           <w:rPr>
             <w:rStyle w:val="Hyperlink"/>
@@ -8627,7 +9535,7 @@
     <w:p/>
     <w:p/>
     <w:sectPr>
-      <w:footerReference w:type="default" r:id="rId78"/>
+      <w:footerReference w:type="default" r:id="rId88"/>
       <w:pgSz w:w="11906" w:h="16838"/>
       <w:pgMar w:top="1440" w:right="1440" w:bottom="1440" w:left="1440" w:header="708" w:footer="708" w:gutter="0"/>
       <w:pgBorders w:offsetFrom="page">
@@ -13061,6 +13969,7 @@
   <w:style w:type="character" w:default="1" w:styleId="DefaultParagraphFont">
     <w:name w:val="Default Paragraph Font"/>
     <w:uiPriority w:val="1"/>
+    <w:semiHidden/>
     <w:unhideWhenUsed/>
   </w:style>
   <w:style w:type="table" w:default="1" w:styleId="TableNormal">
@@ -17028,7 +17937,7 @@
   <dgm:whole/>
   <dgm:extLst>
     <a:ext uri="http://schemas.microsoft.com/office/drawing/2008/diagram">
-      <dsp:dataModelExt xmlns:dsp="http://schemas.microsoft.com/office/drawing/2008/diagram" relId="rId30" minVer="http://schemas.openxmlformats.org/drawingml/2006/diagram"/>
+      <dsp:dataModelExt xmlns:dsp="http://schemas.microsoft.com/office/drawing/2008/diagram" relId="rId40" minVer="http://schemas.openxmlformats.org/drawingml/2006/diagram"/>
     </a:ext>
   </dgm:extLst>
 </dgm:dataModel>
@@ -17649,7 +18558,7 @@
   <dgm:whole/>
   <dgm:extLst>
     <a:ext uri="http://schemas.microsoft.com/office/drawing/2008/diagram">
-      <dsp:dataModelExt xmlns:dsp="http://schemas.microsoft.com/office/drawing/2008/diagram" relId="rId35" minVer="http://schemas.openxmlformats.org/drawingml/2006/diagram"/>
+      <dsp:dataModelExt xmlns:dsp="http://schemas.microsoft.com/office/drawing/2008/diagram" relId="rId45" minVer="http://schemas.openxmlformats.org/drawingml/2006/diagram"/>
     </a:ext>
   </dgm:extLst>
 </dgm:dataModel>
@@ -17935,7 +18844,7 @@
   <dgm:whole/>
   <dgm:extLst>
     <a:ext uri="http://schemas.microsoft.com/office/drawing/2008/diagram">
-      <dsp:dataModelExt xmlns:dsp="http://schemas.microsoft.com/office/drawing/2008/diagram" relId="rId40" minVer="http://schemas.openxmlformats.org/drawingml/2006/diagram"/>
+      <dsp:dataModelExt xmlns:dsp="http://schemas.microsoft.com/office/drawing/2008/diagram" relId="rId50" minVer="http://schemas.openxmlformats.org/drawingml/2006/diagram"/>
     </a:ext>
   </dgm:extLst>
 </dgm:dataModel>
@@ -18457,7 +19366,7 @@
   <dgm:whole/>
   <dgm:extLst>
     <a:ext uri="http://schemas.microsoft.com/office/drawing/2008/diagram">
-      <dsp:dataModelExt xmlns:dsp="http://schemas.microsoft.com/office/drawing/2008/diagram" relId="rId45" minVer="http://schemas.openxmlformats.org/drawingml/2006/diagram"/>
+      <dsp:dataModelExt xmlns:dsp="http://schemas.microsoft.com/office/drawing/2008/diagram" relId="rId55" minVer="http://schemas.openxmlformats.org/drawingml/2006/diagram"/>
     </a:ext>
   </dgm:extLst>
 </dgm:dataModel>
@@ -26617,23 +27526,6 @@
 </file>
 
 <file path=customXml/item1.xml><?xml version="1.0" encoding="utf-8"?>
-<?mso-contentType ?>
-<FormTemplates xmlns="http://schemas.microsoft.com/sharepoint/v3/contenttype/forms">
-  <Display>DocumentLibraryForm</Display>
-  <Edit>DocumentLibraryForm</Edit>
-  <New>DocumentLibraryForm</New>
-</FormTemplates>
-</file>
-
-<file path=customXml/item2.xml><?xml version="1.0" encoding="utf-8"?>
-<p:properties xmlns:p="http://schemas.microsoft.com/office/2006/metadata/properties" xmlns:xsi="http://www.w3.org/2001/XMLSchema-instance" xmlns:pc="http://schemas.microsoft.com/office/infopath/2007/PartnerControls">
-  <documentManagement>
-    <_activity xmlns="d71ff2ac-62c7-44d6-abd7-1383af8796a8" xsi:nil="true"/>
-  </documentManagement>
-</p:properties>
-</file>
-
-<file path=customXml/item3.xml><?xml version="1.0" encoding="utf-8"?>
 <ct:contentTypeSchema xmlns:ct="http://schemas.microsoft.com/office/2006/metadata/contentType" xmlns:ma="http://schemas.microsoft.com/office/2006/metadata/properties/metaAttributes" ct:_="" ma:_="" ma:contentTypeName="Document" ma:contentTypeID="0x0101009908F051F1A7FA40B6E0D78DFA896E6F" ma:contentTypeVersion="15" ma:contentTypeDescription="Create a new document." ma:contentTypeScope="" ma:versionID="16bd8ccdb24192f5a23e1f50082beb91">
   <xsd:schema xmlns:xsd="http://www.w3.org/2001/XMLSchema" xmlns:xs="http://www.w3.org/2001/XMLSchema" xmlns:p="http://schemas.microsoft.com/office/2006/metadata/properties" xmlns:ns3="d71ff2ac-62c7-44d6-abd7-1383af8796a8" xmlns:ns4="19621f95-9056-4b81-ab21-41233ae0d36d" targetNamespace="http://schemas.microsoft.com/office/2006/metadata/properties" ma:root="true" ma:fieldsID="4a6057a7fc35ca9381604f182b6a209d" ns3:_="" ns4:_="">
     <xsd:import namespace="d71ff2ac-62c7-44d6-abd7-1383af8796a8"/>
@@ -26866,29 +27758,28 @@
 </ct:contentTypeSchema>
 </file>
 
-<file path=customXml/item4.xml><?xml version="1.0" encoding="utf-8"?>
+<file path=customXml/item2.xml><?xml version="1.0" encoding="utf-8"?>
+<?mso-contentType ?>
+<FormTemplates xmlns="http://schemas.microsoft.com/sharepoint/v3/contenttype/forms">
+  <Display>DocumentLibraryForm</Display>
+  <Edit>DocumentLibraryForm</Edit>
+  <New>DocumentLibraryForm</New>
+</FormTemplates>
+</file>
+
+<file path=customXml/item3.xml><?xml version="1.0" encoding="utf-8"?>
 <b:Sources xmlns:b="http://schemas.openxmlformats.org/officeDocument/2006/bibliography" xmlns="http://schemas.openxmlformats.org/officeDocument/2006/bibliography" SelectedStyle="\APASixthEditionOfficeOnline.xsl" StyleName="APA" Version="6"/>
 </file>
 
-<file path=customXml/itemProps1.xml><?xml version="1.0" encoding="utf-8"?>
-<ds:datastoreItem xmlns:ds="http://schemas.openxmlformats.org/officeDocument/2006/customXml" ds:itemID="{DBC131DF-4F18-448B-B46F-936BB86E1BD6}">
-  <ds:schemaRefs>
-    <ds:schemaRef ds:uri="http://schemas.microsoft.com/sharepoint/v3/contenttype/forms"/>
-  </ds:schemaRefs>
-</ds:datastoreItem>
+<file path=customXml/item4.xml><?xml version="1.0" encoding="utf-8"?>
+<p:properties xmlns:p="http://schemas.microsoft.com/office/2006/metadata/properties" xmlns:xsi="http://www.w3.org/2001/XMLSchema-instance" xmlns:pc="http://schemas.microsoft.com/office/infopath/2007/PartnerControls">
+  <documentManagement>
+    <_activity xmlns="d71ff2ac-62c7-44d6-abd7-1383af8796a8" xsi:nil="true"/>
+  </documentManagement>
+</p:properties>
 </file>
 
-<file path=customXml/itemProps2.xml><?xml version="1.0" encoding="utf-8"?>
-<ds:datastoreItem xmlns:ds="http://schemas.openxmlformats.org/officeDocument/2006/customXml" ds:itemID="{3F2AE3CF-AF0A-42C7-BC75-AAA91D189F19}">
-  <ds:schemaRefs>
-    <ds:schemaRef ds:uri="http://schemas.microsoft.com/office/2006/metadata/properties"/>
-    <ds:schemaRef ds:uri="http://schemas.microsoft.com/office/infopath/2007/PartnerControls"/>
-    <ds:schemaRef ds:uri="d71ff2ac-62c7-44d6-abd7-1383af8796a8"/>
-  </ds:schemaRefs>
-</ds:datastoreItem>
-</file>
-
-<file path=customXml/itemProps3.xml><?xml version="1.0" encoding="utf-8"?>
+<file path=customXml/itemProps1.xml><?xml version="1.0" encoding="utf-8"?>
 <ds:datastoreItem xmlns:ds="http://schemas.openxmlformats.org/officeDocument/2006/customXml" ds:itemID="{9E4FD10E-ECE4-47FC-B486-A980A4B50C09}">
   <ds:schemaRefs>
     <ds:schemaRef ds:uri="http://schemas.microsoft.com/office/2006/metadata/contentType"/>
@@ -26907,10 +27798,28 @@
 </ds:datastoreItem>
 </file>
 
-<file path=customXml/itemProps4.xml><?xml version="1.0" encoding="utf-8"?>
+<file path=customXml/itemProps2.xml><?xml version="1.0" encoding="utf-8"?>
+<ds:datastoreItem xmlns:ds="http://schemas.openxmlformats.org/officeDocument/2006/customXml" ds:itemID="{DBC131DF-4F18-448B-B46F-936BB86E1BD6}">
+  <ds:schemaRefs>
+    <ds:schemaRef ds:uri="http://schemas.microsoft.com/sharepoint/v3/contenttype/forms"/>
+  </ds:schemaRefs>
+</ds:datastoreItem>
+</file>
+
+<file path=customXml/itemProps3.xml><?xml version="1.0" encoding="utf-8"?>
 <ds:datastoreItem xmlns:ds="http://schemas.openxmlformats.org/officeDocument/2006/customXml" ds:itemID="{500AA85C-6BEF-45D1-AD66-44E6B9A5378D}">
   <ds:schemaRefs>
     <ds:schemaRef ds:uri="http://schemas.openxmlformats.org/officeDocument/2006/bibliography"/>
   </ds:schemaRefs>
 </ds:datastoreItem>
+</file>
+
+<file path=customXml/itemProps4.xml><?xml version="1.0" encoding="utf-8"?>
+<ds:datastoreItem xmlns:ds="http://schemas.openxmlformats.org/officeDocument/2006/customXml" ds:itemID="{3F2AE3CF-AF0A-42C7-BC75-AAA91D189F19}">
+  <ds:schemaRefs>
+    <ds:schemaRef ds:uri="http://schemas.microsoft.com/office/2006/metadata/properties"/>
+    <ds:schemaRef ds:uri="http://schemas.microsoft.com/office/infopath/2007/PartnerControls"/>
+    <ds:schemaRef ds:uri="d71ff2ac-62c7-44d6-abd7-1383af8796a8"/>
+  </ds:schemaRefs>
+</ds:datastoreItem>
 </file>
</xml_diff>